<commit_message>
Add Hebrew sources to seminar paper
Integrate four verified Hebrew academic sources (Fisher & Friedman
2009; Friedman 2011; Katzenelson 2014; Mashiach 2023) into the paper
body and reference list, and italicize journal titles per APA 7.
Word count now 7,750; 27 sources total, 5 in Hebrew.

Co-Authored-By: Claude Fable 5 <noreply@anthropic.com>
Claude-Session: https://claude.ai/code/session_01FN9ao3FedeqCyCJjoBfH25
</commit_message>
<xml_diff>
--- a/docs/התמודדות מורים עם מעורבות הורים - מתוקן.docx
+++ b/docs/התמודדות מורים עם מעורבות הורים - מתוקן.docx
@@ -12,6 +12,7 @@
         <w:rPr>
           <w:rFonts w:ascii="Times New Roman" w:cs="David" w:eastAsia="David" w:hAnsi="Times New Roman"/>
           <w:b w:val="false"/>
+          <w:i w:val="false"/>
           <w:color w:val="000000"/>
           <w:sz w:val="24"/>
           <w:szCs w:val="24"/>
@@ -31,6 +32,7 @@
           <w:rFonts w:ascii="Times New Roman" w:cs="David" w:eastAsia="David" w:hAnsi="Times New Roman"/>
           <w:b/>
           <w:bCs/>
+          <w:i w:val="false"/>
           <w:color w:val="000000"/>
           <w:sz w:val="32"/>
           <w:szCs w:val="32"/>
@@ -49,6 +51,7 @@
         <w:rPr>
           <w:rFonts w:ascii="Times New Roman" w:cs="David" w:eastAsia="David" w:hAnsi="Times New Roman"/>
           <w:b w:val="false"/>
+          <w:i w:val="false"/>
           <w:color w:val="000000"/>
           <w:sz w:val="26"/>
           <w:szCs w:val="26"/>
@@ -67,6 +70,7 @@
         <w:rPr>
           <w:rFonts w:ascii="Times New Roman" w:cs="David" w:eastAsia="David" w:hAnsi="Times New Roman"/>
           <w:b w:val="false"/>
+          <w:i w:val="false"/>
           <w:color w:val="000000"/>
           <w:sz w:val="24"/>
           <w:szCs w:val="24"/>
@@ -86,6 +90,7 @@
           <w:rFonts w:ascii="Times New Roman" w:cs="David" w:eastAsia="David" w:hAnsi="Times New Roman"/>
           <w:b/>
           <w:bCs/>
+          <w:i w:val="false"/>
           <w:color w:val="000000"/>
           <w:sz w:val="26"/>
           <w:szCs w:val="26"/>
@@ -105,6 +110,7 @@
           <w:rFonts w:ascii="Times New Roman" w:cs="David" w:eastAsia="David" w:hAnsi="Times New Roman"/>
           <w:b/>
           <w:bCs/>
+          <w:i w:val="false"/>
           <w:color w:val="000000"/>
           <w:sz w:val="34"/>
           <w:szCs w:val="34"/>
@@ -123,6 +129,7 @@
         <w:rPr>
           <w:rFonts w:ascii="Times New Roman" w:cs="David" w:eastAsia="David" w:hAnsi="Times New Roman"/>
           <w:b w:val="false"/>
+          <w:i w:val="false"/>
           <w:color w:val="000000"/>
           <w:sz w:val="24"/>
           <w:szCs w:val="24"/>
@@ -141,6 +148,7 @@
         <w:rPr>
           <w:rFonts w:ascii="Times New Roman" w:cs="David" w:eastAsia="David" w:hAnsi="Times New Roman"/>
           <w:b w:val="false"/>
+          <w:i w:val="false"/>
           <w:color w:val="000000"/>
           <w:sz w:val="24"/>
           <w:szCs w:val="24"/>
@@ -159,6 +167,7 @@
         <w:rPr>
           <w:rFonts w:ascii="Times New Roman" w:cs="David" w:eastAsia="David" w:hAnsi="Times New Roman"/>
           <w:b w:val="false"/>
+          <w:i w:val="false"/>
           <w:color w:val="000000"/>
           <w:sz w:val="24"/>
           <w:szCs w:val="24"/>
@@ -177,6 +186,7 @@
         <w:rPr>
           <w:rFonts w:ascii="Times New Roman" w:cs="David" w:eastAsia="David" w:hAnsi="Times New Roman"/>
           <w:b w:val="false"/>
+          <w:i w:val="false"/>
           <w:color w:val="000000"/>
           <w:sz w:val="24"/>
           <w:szCs w:val="24"/>
@@ -195,6 +205,7 @@
         <w:rPr>
           <w:rFonts w:ascii="Times New Roman" w:cs="David" w:eastAsia="David" w:hAnsi="Times New Roman"/>
           <w:b w:val="false"/>
+          <w:i w:val="false"/>
           <w:color w:val="000000"/>
           <w:sz w:val="24"/>
           <w:szCs w:val="24"/>
@@ -216,6 +227,7 @@
           <w:rFonts w:ascii="Times New Roman" w:cs="David" w:eastAsia="David" w:hAnsi="Times New Roman"/>
           <w:b/>
           <w:bCs/>
+          <w:i w:val="false"/>
           <w:color w:val="000000"/>
           <w:sz w:val="32"/>
           <w:szCs w:val="32"/>
@@ -234,6 +246,7 @@
         <w:rPr>
           <w:rFonts w:ascii="Times New Roman" w:cs="David" w:eastAsia="David" w:hAnsi="Times New Roman"/>
           <w:b w:val="false"/>
+          <w:i w:val="false"/>
           <w:color w:val="000000"/>
           <w:sz w:val="24"/>
           <w:szCs w:val="24"/>
@@ -252,6 +265,7 @@
         <w:rPr>
           <w:rFonts w:ascii="Times New Roman" w:cs="David" w:eastAsia="David" w:hAnsi="Times New Roman"/>
           <w:b w:val="false"/>
+          <w:i w:val="false"/>
           <w:color w:val="000000"/>
           <w:sz w:val="24"/>
           <w:szCs w:val="24"/>
@@ -273,6 +287,7 @@
           <w:rFonts w:ascii="Times New Roman" w:cs="David" w:eastAsia="David" w:hAnsi="Times New Roman"/>
           <w:b/>
           <w:bCs/>
+          <w:i w:val="false"/>
           <w:color w:val="000000"/>
           <w:sz w:val="32"/>
           <w:szCs w:val="32"/>
@@ -321,6 +336,7 @@
                 <w:rFonts w:ascii="Times New Roman" w:cs="David" w:eastAsia="David" w:hAnsi="Times New Roman"/>
                 <w:b/>
                 <w:bCs/>
+                <w:i w:val="false"/>
                 <w:color w:val="000000"/>
                 <w:sz w:val="24"/>
                 <w:szCs w:val="24"/>
@@ -351,6 +367,7 @@
               <w:rPr>
                 <w:rFonts w:ascii="Times New Roman" w:cs="David" w:eastAsia="David" w:hAnsi="Times New Roman"/>
                 <w:b w:val="false"/>
+                <w:i w:val="false"/>
                 <w:color w:val="000000"/>
                 <w:sz w:val="24"/>
                 <w:szCs w:val="24"/>
@@ -384,6 +401,7 @@
                 <w:rFonts w:ascii="Times New Roman" w:cs="David" w:eastAsia="David" w:hAnsi="Times New Roman"/>
                 <w:b/>
                 <w:bCs/>
+                <w:i w:val="false"/>
                 <w:color w:val="000000"/>
                 <w:sz w:val="24"/>
                 <w:szCs w:val="24"/>
@@ -414,6 +432,7 @@
               <w:rPr>
                 <w:rFonts w:ascii="Times New Roman" w:cs="David" w:eastAsia="David" w:hAnsi="Times New Roman"/>
                 <w:b w:val="false"/>
+                <w:i w:val="false"/>
                 <w:color w:val="000000"/>
                 <w:sz w:val="24"/>
                 <w:szCs w:val="24"/>
@@ -447,6 +466,7 @@
               <w:rPr>
                 <w:rFonts w:ascii="Times New Roman" w:cs="David" w:eastAsia="David" w:hAnsi="Times New Roman"/>
                 <w:b w:val="false"/>
+                <w:i w:val="false"/>
                 <w:color w:val="000000"/>
                 <w:sz w:val="24"/>
                 <w:szCs w:val="24"/>
@@ -477,6 +497,7 @@
               <w:rPr>
                 <w:rFonts w:ascii="Times New Roman" w:cs="David" w:eastAsia="David" w:hAnsi="Times New Roman"/>
                 <w:b w:val="false"/>
+                <w:i w:val="false"/>
                 <w:color w:val="000000"/>
                 <w:sz w:val="24"/>
                 <w:szCs w:val="24"/>
@@ -510,6 +531,7 @@
               <w:rPr>
                 <w:rFonts w:ascii="Times New Roman" w:cs="David" w:eastAsia="David" w:hAnsi="Times New Roman"/>
                 <w:b w:val="false"/>
+                <w:i w:val="false"/>
                 <w:color w:val="000000"/>
                 <w:sz w:val="24"/>
                 <w:szCs w:val="24"/>
@@ -540,6 +562,7 @@
               <w:rPr>
                 <w:rFonts w:ascii="Times New Roman" w:cs="David" w:eastAsia="David" w:hAnsi="Times New Roman"/>
                 <w:b w:val="false"/>
+                <w:i w:val="false"/>
                 <w:color w:val="000000"/>
                 <w:sz w:val="24"/>
                 <w:szCs w:val="24"/>
@@ -573,6 +596,7 @@
               <w:rPr>
                 <w:rFonts w:ascii="Times New Roman" w:cs="David" w:eastAsia="David" w:hAnsi="Times New Roman"/>
                 <w:b w:val="false"/>
+                <w:i w:val="false"/>
                 <w:color w:val="000000"/>
                 <w:sz w:val="24"/>
                 <w:szCs w:val="24"/>
@@ -603,6 +627,7 @@
               <w:rPr>
                 <w:rFonts w:ascii="Times New Roman" w:cs="David" w:eastAsia="David" w:hAnsi="Times New Roman"/>
                 <w:b w:val="false"/>
+                <w:i w:val="false"/>
                 <w:color w:val="000000"/>
                 <w:sz w:val="24"/>
                 <w:szCs w:val="24"/>
@@ -636,6 +661,7 @@
                 <w:rFonts w:ascii="Times New Roman" w:cs="David" w:eastAsia="David" w:hAnsi="Times New Roman"/>
                 <w:b/>
                 <w:bCs/>
+                <w:i w:val="false"/>
                 <w:color w:val="000000"/>
                 <w:sz w:val="24"/>
                 <w:szCs w:val="24"/>
@@ -666,6 +692,7 @@
               <w:rPr>
                 <w:rFonts w:ascii="Times New Roman" w:cs="David" w:eastAsia="David" w:hAnsi="Times New Roman"/>
                 <w:b w:val="false"/>
+                <w:i w:val="false"/>
                 <w:color w:val="000000"/>
                 <w:sz w:val="24"/>
                 <w:szCs w:val="24"/>
@@ -699,6 +726,7 @@
               <w:rPr>
                 <w:rFonts w:ascii="Times New Roman" w:cs="David" w:eastAsia="David" w:hAnsi="Times New Roman"/>
                 <w:b w:val="false"/>
+                <w:i w:val="false"/>
                 <w:color w:val="000000"/>
                 <w:sz w:val="24"/>
                 <w:szCs w:val="24"/>
@@ -729,6 +757,7 @@
               <w:rPr>
                 <w:rFonts w:ascii="Times New Roman" w:cs="David" w:eastAsia="David" w:hAnsi="Times New Roman"/>
                 <w:b w:val="false"/>
+                <w:i w:val="false"/>
                 <w:color w:val="000000"/>
                 <w:sz w:val="24"/>
                 <w:szCs w:val="24"/>
@@ -762,6 +791,7 @@
               <w:rPr>
                 <w:rFonts w:ascii="Times New Roman" w:cs="David" w:eastAsia="David" w:hAnsi="Times New Roman"/>
                 <w:b w:val="false"/>
+                <w:i w:val="false"/>
                 <w:color w:val="000000"/>
                 <w:sz w:val="24"/>
                 <w:szCs w:val="24"/>
@@ -792,6 +822,7 @@
               <w:rPr>
                 <w:rFonts w:ascii="Times New Roman" w:cs="David" w:eastAsia="David" w:hAnsi="Times New Roman"/>
                 <w:b w:val="false"/>
+                <w:i w:val="false"/>
                 <w:color w:val="000000"/>
                 <w:sz w:val="24"/>
                 <w:szCs w:val="24"/>
@@ -825,6 +856,7 @@
                 <w:rFonts w:ascii="Times New Roman" w:cs="David" w:eastAsia="David" w:hAnsi="Times New Roman"/>
                 <w:b/>
                 <w:bCs/>
+                <w:i w:val="false"/>
                 <w:color w:val="000000"/>
                 <w:sz w:val="24"/>
                 <w:szCs w:val="24"/>
@@ -855,6 +887,7 @@
               <w:rPr>
                 <w:rFonts w:ascii="Times New Roman" w:cs="David" w:eastAsia="David" w:hAnsi="Times New Roman"/>
                 <w:b w:val="false"/>
+                <w:i w:val="false"/>
                 <w:color w:val="000000"/>
                 <w:sz w:val="24"/>
                 <w:szCs w:val="24"/>
@@ -888,6 +921,7 @@
                 <w:rFonts w:ascii="Times New Roman" w:cs="David" w:eastAsia="David" w:hAnsi="Times New Roman"/>
                 <w:b/>
                 <w:bCs/>
+                <w:i w:val="false"/>
                 <w:color w:val="000000"/>
                 <w:sz w:val="24"/>
                 <w:szCs w:val="24"/>
@@ -918,6 +952,7 @@
               <w:rPr>
                 <w:rFonts w:ascii="Times New Roman" w:cs="David" w:eastAsia="David" w:hAnsi="Times New Roman"/>
                 <w:b w:val="false"/>
+                <w:i w:val="false"/>
                 <w:color w:val="000000"/>
                 <w:sz w:val="24"/>
                 <w:szCs w:val="24"/>
@@ -951,6 +986,7 @@
                 <w:rFonts w:ascii="Times New Roman" w:cs="David" w:eastAsia="David" w:hAnsi="Times New Roman"/>
                 <w:b/>
                 <w:bCs/>
+                <w:i w:val="false"/>
                 <w:color w:val="000000"/>
                 <w:sz w:val="24"/>
                 <w:szCs w:val="24"/>
@@ -981,6 +1017,7 @@
               <w:rPr>
                 <w:rFonts w:ascii="Times New Roman" w:cs="David" w:eastAsia="David" w:hAnsi="Times New Roman"/>
                 <w:b w:val="false"/>
+                <w:i w:val="false"/>
                 <w:color w:val="000000"/>
                 <w:sz w:val="24"/>
                 <w:szCs w:val="24"/>
@@ -1005,6 +1042,7 @@
           <w:rFonts w:ascii="Times New Roman" w:cs="David" w:eastAsia="David" w:hAnsi="Times New Roman"/>
           <w:b/>
           <w:bCs/>
+          <w:i w:val="false"/>
           <w:color w:val="000000"/>
           <w:sz w:val="32"/>
           <w:szCs w:val="32"/>
@@ -1023,6 +1061,7 @@
         <w:rPr>
           <w:rFonts w:ascii="Times New Roman" w:cs="David" w:eastAsia="David" w:hAnsi="Times New Roman"/>
           <w:b w:val="false"/>
+          <w:i w:val="false"/>
           <w:color w:val="000000"/>
           <w:sz w:val="24"/>
           <w:szCs w:val="24"/>
@@ -1041,6 +1080,7 @@
         <w:rPr>
           <w:rFonts w:ascii="Times New Roman" w:cs="David" w:eastAsia="David" w:hAnsi="Times New Roman"/>
           <w:b w:val="false"/>
+          <w:i w:val="false"/>
           <w:color w:val="000000"/>
           <w:sz w:val="24"/>
           <w:szCs w:val="24"/>
@@ -1059,6 +1099,7 @@
         <w:rPr>
           <w:rFonts w:ascii="Times New Roman" w:cs="David" w:eastAsia="David" w:hAnsi="Times New Roman"/>
           <w:b w:val="false"/>
+          <w:i w:val="false"/>
           <w:color w:val="000000"/>
           <w:sz w:val="24"/>
           <w:szCs w:val="24"/>
@@ -1077,6 +1118,7 @@
         <w:rPr>
           <w:rFonts w:ascii="Times New Roman" w:cs="David" w:eastAsia="David" w:hAnsi="Times New Roman"/>
           <w:b w:val="false"/>
+          <w:i w:val="false"/>
           <w:color w:val="000000"/>
           <w:sz w:val="24"/>
           <w:szCs w:val="24"/>
@@ -1095,6 +1137,7 @@
         <w:rPr>
           <w:rFonts w:ascii="Times New Roman" w:cs="David" w:eastAsia="David" w:hAnsi="Times New Roman"/>
           <w:b w:val="false"/>
+          <w:i w:val="false"/>
           <w:color w:val="000000"/>
           <w:sz w:val="24"/>
           <w:szCs w:val="24"/>
@@ -1113,6 +1156,7 @@
         <w:rPr>
           <w:rFonts w:ascii="Times New Roman" w:cs="David" w:eastAsia="David" w:hAnsi="Times New Roman"/>
           <w:b w:val="false"/>
+          <w:i w:val="false"/>
           <w:color w:val="000000"/>
           <w:sz w:val="24"/>
           <w:szCs w:val="24"/>
@@ -1131,6 +1175,7 @@
         <w:rPr>
           <w:rFonts w:ascii="Times New Roman" w:cs="David" w:eastAsia="David" w:hAnsi="Times New Roman"/>
           <w:b w:val="false"/>
+          <w:i w:val="false"/>
           <w:color w:val="000000"/>
           <w:sz w:val="24"/>
           <w:szCs w:val="24"/>
@@ -1149,6 +1194,7 @@
         <w:rPr>
           <w:rFonts w:ascii="Times New Roman" w:cs="David" w:eastAsia="David" w:hAnsi="Times New Roman"/>
           <w:b w:val="false"/>
+          <w:i w:val="false"/>
           <w:color w:val="000000"/>
           <w:sz w:val="24"/>
           <w:szCs w:val="24"/>
@@ -1167,6 +1213,7 @@
         <w:rPr>
           <w:rFonts w:ascii="Times New Roman" w:cs="David" w:eastAsia="David" w:hAnsi="Times New Roman"/>
           <w:b w:val="false"/>
+          <w:i w:val="false"/>
           <w:color w:val="000000"/>
           <w:sz w:val="24"/>
           <w:szCs w:val="24"/>
@@ -1185,6 +1232,7 @@
         <w:rPr>
           <w:rFonts w:ascii="Times New Roman" w:cs="David" w:eastAsia="David" w:hAnsi="Times New Roman"/>
           <w:b w:val="false"/>
+          <w:i w:val="false"/>
           <w:color w:val="000000"/>
           <w:sz w:val="24"/>
           <w:szCs w:val="24"/>
@@ -1203,6 +1251,7 @@
         <w:rPr>
           <w:rFonts w:ascii="Times New Roman" w:cs="David" w:eastAsia="David" w:hAnsi="Times New Roman"/>
           <w:b w:val="false"/>
+          <w:i w:val="false"/>
           <w:color w:val="000000"/>
           <w:sz w:val="24"/>
           <w:szCs w:val="24"/>
@@ -1221,6 +1270,7 @@
         <w:rPr>
           <w:rFonts w:ascii="Times New Roman" w:cs="David" w:eastAsia="David" w:hAnsi="Times New Roman"/>
           <w:b w:val="false"/>
+          <w:i w:val="false"/>
           <w:color w:val="000000"/>
           <w:sz w:val="24"/>
           <w:szCs w:val="24"/>
@@ -1242,6 +1292,7 @@
           <w:rFonts w:ascii="Times New Roman" w:cs="David" w:eastAsia="David" w:hAnsi="Times New Roman"/>
           <w:b/>
           <w:bCs/>
+          <w:i w:val="false"/>
           <w:color w:val="000000"/>
           <w:sz w:val="32"/>
           <w:szCs w:val="32"/>
@@ -1260,6 +1311,7 @@
         <w:rPr>
           <w:rFonts w:ascii="Times New Roman" w:cs="David" w:eastAsia="David" w:hAnsi="Times New Roman"/>
           <w:b w:val="false"/>
+          <w:i w:val="false"/>
           <w:color w:val="000000"/>
           <w:sz w:val="24"/>
           <w:szCs w:val="24"/>
@@ -1280,6 +1332,7 @@
           <w:rFonts w:ascii="Times New Roman" w:cs="David" w:eastAsia="David" w:hAnsi="Times New Roman"/>
           <w:b/>
           <w:bCs/>
+          <w:i w:val="false"/>
           <w:color w:val="000000"/>
           <w:sz w:val="28"/>
           <w:szCs w:val="28"/>
@@ -1298,6 +1351,7 @@
         <w:rPr>
           <w:rFonts w:ascii="Times New Roman" w:cs="David" w:eastAsia="David" w:hAnsi="Times New Roman"/>
           <w:b w:val="false"/>
+          <w:i w:val="false"/>
           <w:color w:val="000000"/>
           <w:sz w:val="24"/>
           <w:szCs w:val="24"/>
@@ -1316,6 +1370,7 @@
         <w:rPr>
           <w:rFonts w:ascii="Times New Roman" w:cs="David" w:eastAsia="David" w:hAnsi="Times New Roman"/>
           <w:b w:val="false"/>
+          <w:i w:val="false"/>
           <w:color w:val="000000"/>
           <w:sz w:val="24"/>
           <w:szCs w:val="24"/>
@@ -1334,6 +1389,7 @@
         <w:rPr>
           <w:rFonts w:ascii="Times New Roman" w:cs="David" w:eastAsia="David" w:hAnsi="Times New Roman"/>
           <w:b w:val="false"/>
+          <w:i w:val="false"/>
           <w:color w:val="000000"/>
           <w:sz w:val="24"/>
           <w:szCs w:val="24"/>
@@ -1352,6 +1408,7 @@
         <w:rPr>
           <w:rFonts w:ascii="Times New Roman" w:cs="David" w:eastAsia="David" w:hAnsi="Times New Roman"/>
           <w:b w:val="false"/>
+          <w:i w:val="false"/>
           <w:color w:val="000000"/>
           <w:sz w:val="24"/>
           <w:szCs w:val="24"/>
@@ -1370,6 +1427,7 @@
         <w:rPr>
           <w:rFonts w:ascii="Times New Roman" w:cs="David" w:eastAsia="David" w:hAnsi="Times New Roman"/>
           <w:b w:val="false"/>
+          <w:i w:val="false"/>
           <w:color w:val="000000"/>
           <w:sz w:val="24"/>
           <w:szCs w:val="24"/>
@@ -1388,6 +1446,7 @@
         <w:rPr>
           <w:rFonts w:ascii="Times New Roman" w:cs="David" w:eastAsia="David" w:hAnsi="Times New Roman"/>
           <w:b w:val="false"/>
+          <w:i w:val="false"/>
           <w:color w:val="000000"/>
           <w:sz w:val="24"/>
           <w:szCs w:val="24"/>
@@ -1406,6 +1465,7 @@
         <w:rPr>
           <w:rFonts w:ascii="Times New Roman" w:cs="David" w:eastAsia="David" w:hAnsi="Times New Roman"/>
           <w:b w:val="false"/>
+          <w:i w:val="false"/>
           <w:color w:val="000000"/>
           <w:sz w:val="24"/>
           <w:szCs w:val="24"/>
@@ -1424,6 +1484,7 @@
         <w:rPr>
           <w:rFonts w:ascii="Times New Roman" w:cs="David" w:eastAsia="David" w:hAnsi="Times New Roman"/>
           <w:b w:val="false"/>
+          <w:i w:val="false"/>
           <w:color w:val="000000"/>
           <w:sz w:val="24"/>
           <w:szCs w:val="24"/>
@@ -1444,6 +1505,7 @@
           <w:rFonts w:ascii="Times New Roman" w:cs="David" w:eastAsia="David" w:hAnsi="Times New Roman"/>
           <w:b/>
           <w:bCs/>
+          <w:i w:val="false"/>
           <w:color w:val="000000"/>
           <w:sz w:val="28"/>
           <w:szCs w:val="28"/>
@@ -1462,6 +1524,7 @@
         <w:rPr>
           <w:rFonts w:ascii="Times New Roman" w:cs="David" w:eastAsia="David" w:hAnsi="Times New Roman"/>
           <w:b w:val="false"/>
+          <w:i w:val="false"/>
           <w:color w:val="000000"/>
           <w:sz w:val="24"/>
           <w:szCs w:val="24"/>
@@ -1480,6 +1543,7 @@
         <w:rPr>
           <w:rFonts w:ascii="Times New Roman" w:cs="David" w:eastAsia="David" w:hAnsi="Times New Roman"/>
           <w:b w:val="false"/>
+          <w:i w:val="false"/>
           <w:color w:val="000000"/>
           <w:sz w:val="24"/>
           <w:szCs w:val="24"/>
@@ -1498,6 +1562,7 @@
         <w:rPr>
           <w:rFonts w:ascii="Times New Roman" w:cs="David" w:eastAsia="David" w:hAnsi="Times New Roman"/>
           <w:b w:val="false"/>
+          <w:i w:val="false"/>
           <w:color w:val="000000"/>
           <w:sz w:val="24"/>
           <w:szCs w:val="24"/>
@@ -1516,6 +1581,26 @@
         <w:rPr>
           <w:rFonts w:ascii="Times New Roman" w:cs="David" w:eastAsia="David" w:hAnsi="Times New Roman"/>
           <w:b w:val="false"/>
+          <w:i w:val="false"/>
+          <w:color w:val="000000"/>
+          <w:sz w:val="24"/>
+          <w:szCs w:val="24"/>
+          <w:rtl/>
+        </w:rPr>
+        <w:t xml:space="preserve">בהקשר הישראלי הוצע מודל המנסה לנבא את רמת המעורבות של ההורה. פישר ופרידמן (2009) בנו מודל תיאורטי המבחין בין מעורבות פעילה לבין מעורבות סבילה, ומגדירים מנבאים של רמות המעורבות לצד משתני רקע של ההורה ושל בית הספר. משיח (2023) מוסיף גורם מבני נוסף: במחקר שנערך בישראל הוא בחן האם הורים למשפחות בנות ארבעה ילדים ומעלה מעורבים פחות בלימודי ילדיהם, והעמיד את גודל המשפחה במוקד הדיון על חלוקת המשאבים ההוריים. שני המקורות מדגימים שדפוסי מעורבות מושפעים ממאפיינים משפחתיים מדידים, ולא רק מרצונו הטוב של ההורה.</w:t>
+      </w:r>
+    </w:p>
+    <w:p>
+      <w:pPr>
+        <w:bidi/>
+        <w:spacing w:after="120" w:line="360"/>
+        <w:jc w:val="both"/>
+      </w:pPr>
+      <w:r>
+        <w:rPr>
+          <w:rFonts w:ascii="Times New Roman" w:cs="David" w:eastAsia="David" w:hAnsi="Times New Roman"/>
+          <w:b w:val="false"/>
+          <w:i w:val="false"/>
           <w:color w:val="000000"/>
           <w:sz w:val="24"/>
           <w:szCs w:val="24"/>
@@ -1534,6 +1619,7 @@
         <w:rPr>
           <w:rFonts w:ascii="Times New Roman" w:cs="David" w:eastAsia="David" w:hAnsi="Times New Roman"/>
           <w:b w:val="false"/>
+          <w:i w:val="false"/>
           <w:color w:val="000000"/>
           <w:sz w:val="24"/>
           <w:szCs w:val="24"/>
@@ -1552,6 +1638,7 @@
         <w:rPr>
           <w:rFonts w:ascii="Times New Roman" w:cs="David" w:eastAsia="David" w:hAnsi="Times New Roman"/>
           <w:b w:val="false"/>
+          <w:i w:val="false"/>
           <w:color w:val="000000"/>
           <w:sz w:val="24"/>
           <w:szCs w:val="24"/>
@@ -1570,6 +1657,7 @@
         <w:rPr>
           <w:rFonts w:ascii="Times New Roman" w:cs="David" w:eastAsia="David" w:hAnsi="Times New Roman"/>
           <w:b w:val="false"/>
+          <w:i w:val="false"/>
           <w:color w:val="000000"/>
           <w:sz w:val="24"/>
           <w:szCs w:val="24"/>
@@ -1590,6 +1678,7 @@
           <w:rFonts w:ascii="Times New Roman" w:cs="David" w:eastAsia="David" w:hAnsi="Times New Roman"/>
           <w:b/>
           <w:bCs/>
+          <w:i w:val="false"/>
           <w:color w:val="000000"/>
           <w:sz w:val="28"/>
           <w:szCs w:val="28"/>
@@ -1608,6 +1697,7 @@
         <w:rPr>
           <w:rFonts w:ascii="Times New Roman" w:cs="David" w:eastAsia="David" w:hAnsi="Times New Roman"/>
           <w:b w:val="false"/>
+          <w:i w:val="false"/>
           <w:color w:val="000000"/>
           <w:sz w:val="24"/>
           <w:szCs w:val="24"/>
@@ -1626,6 +1716,7 @@
         <w:rPr>
           <w:rFonts w:ascii="Times New Roman" w:cs="David" w:eastAsia="David" w:hAnsi="Times New Roman"/>
           <w:b w:val="false"/>
+          <w:i w:val="false"/>
           <w:color w:val="000000"/>
           <w:sz w:val="24"/>
           <w:szCs w:val="24"/>
@@ -1644,6 +1735,7 @@
         <w:rPr>
           <w:rFonts w:ascii="Times New Roman" w:cs="David" w:eastAsia="David" w:hAnsi="Times New Roman"/>
           <w:b w:val="false"/>
+          <w:i w:val="false"/>
           <w:color w:val="000000"/>
           <w:sz w:val="24"/>
           <w:szCs w:val="24"/>
@@ -1662,6 +1754,7 @@
         <w:rPr>
           <w:rFonts w:ascii="Times New Roman" w:cs="David" w:eastAsia="David" w:hAnsi="Times New Roman"/>
           <w:b w:val="false"/>
+          <w:i w:val="false"/>
           <w:color w:val="000000"/>
           <w:sz w:val="24"/>
           <w:szCs w:val="24"/>
@@ -1680,24 +1773,26 @@
         <w:rPr>
           <w:rFonts w:ascii="Times New Roman" w:cs="David" w:eastAsia="David" w:hAnsi="Times New Roman"/>
           <w:b w:val="false"/>
-          <w:color w:val="000000"/>
-          <w:sz w:val="24"/>
-          <w:szCs w:val="24"/>
-          <w:rtl/>
-        </w:rPr>
-        <w:t xml:space="preserve">גם בהקשר הישראלי נמצא שהקשר בין הורים למורים מעוצב על ידי הסביבה החברתית והתרבותית. מחקר כמותי שנערך בישראל והשווה הורים יהודים והורים ערבים מצא כי דפוסי יחסי העזרה בין הורים למורים שונים בין הקבוצות ומושפעים ממשאבים ומנורמות תרבותיות (Grinshtain &amp; Harpaz, 2023). מחקר ישראלי נוסף מצא כי תחושת קהילתיות מנבאת תפיסת סמכות של המורה ומעורבות הורית (Fisher &amp; Refael Fanyo, 2022). ממצאים אלה מלמדים שעמדות מורים והורים אינן מתגבשות בחלל ריק, אלא בתוך קהילה מסוימת.</w:t>
-      </w:r>
-    </w:p>
-    <w:p>
-      <w:pPr>
-        <w:bidi/>
-        <w:spacing w:after="120" w:line="360"/>
-        <w:jc w:val="both"/>
-      </w:pPr>
-      <w:r>
-        <w:rPr>
-          <w:rFonts w:ascii="Times New Roman" w:cs="David" w:eastAsia="David" w:hAnsi="Times New Roman"/>
-          <w:b w:val="false"/>
+          <w:i w:val="false"/>
+          <w:color w:val="000000"/>
+          <w:sz w:val="24"/>
+          <w:szCs w:val="24"/>
+          <w:rtl/>
+        </w:rPr>
+        <w:t xml:space="preserve">גם בהקשר הישראלי נמצא שהקשר בין הורים למורים מעוצב על ידי הסביבה החברתית והתרבותית. פרידמן (2011), בסקירה מקיפה של יחסי בית הספר וההורים בישראל, מתאר את התפתחות היחסים מריחוק ושמירה על גבולות נוקשים ועד ציפייה גוברת לשותפות, ומצביע על מתח מובנה בין הסמכות המקצועית של המורה לבין רצון ההורים להשפיע. מחקר כמותי שנערך בישראל והשווה הורים יהודים והורים ערבים מצא כי דפוסי יחסי העזרה בין הורים למורים שונים בין הקבוצות ומושפעים ממשאבים ומנורמות תרבותיות (Grinshtain &amp; Harpaz, 2023). מחקר ישראלי נוסף מצא כי תחושת קהילתיות מנבאת תפיסת סמכות של המורה ומעורבות הורית (Fisher &amp; Refael Fanyo, 2022). ממצאים אלה מלמדים שעמדות מורים והורים אינן מתגבשות בחלל ריק, אלא בתוך קהילה מסוימת.</w:t>
+      </w:r>
+    </w:p>
+    <w:p>
+      <w:pPr>
+        <w:bidi/>
+        <w:spacing w:after="120" w:line="360"/>
+        <w:jc w:val="both"/>
+      </w:pPr>
+      <w:r>
+        <w:rPr>
+          <w:rFonts w:ascii="Times New Roman" w:cs="David" w:eastAsia="David" w:hAnsi="Times New Roman"/>
+          <w:b w:val="false"/>
+          <w:i w:val="false"/>
           <w:color w:val="000000"/>
           <w:sz w:val="24"/>
           <w:szCs w:val="24"/>
@@ -1719,6 +1814,7 @@
           <w:rFonts w:ascii="Times New Roman" w:cs="David" w:eastAsia="David" w:hAnsi="Times New Roman"/>
           <w:b/>
           <w:bCs/>
+          <w:i w:val="false"/>
           <w:color w:val="000000"/>
           <w:sz w:val="32"/>
           <w:szCs w:val="32"/>
@@ -1737,6 +1833,7 @@
         <w:rPr>
           <w:rFonts w:ascii="Times New Roman" w:cs="David" w:eastAsia="David" w:hAnsi="Times New Roman"/>
           <w:b w:val="false"/>
+          <w:i w:val="false"/>
           <w:color w:val="000000"/>
           <w:sz w:val="24"/>
           <w:szCs w:val="24"/>
@@ -1757,6 +1854,7 @@
           <w:rFonts w:ascii="Times New Roman" w:cs="David" w:eastAsia="David" w:hAnsi="Times New Roman"/>
           <w:b/>
           <w:bCs/>
+          <w:i w:val="false"/>
           <w:color w:val="000000"/>
           <w:sz w:val="28"/>
           <w:szCs w:val="28"/>
@@ -1775,6 +1873,7 @@
         <w:rPr>
           <w:rFonts w:ascii="Times New Roman" w:cs="David" w:eastAsia="David" w:hAnsi="Times New Roman"/>
           <w:b w:val="false"/>
+          <w:i w:val="false"/>
           <w:color w:val="000000"/>
           <w:sz w:val="24"/>
           <w:szCs w:val="24"/>
@@ -1793,6 +1892,7 @@
         <w:rPr>
           <w:rFonts w:ascii="Times New Roman" w:cs="David" w:eastAsia="David" w:hAnsi="Times New Roman"/>
           <w:b w:val="false"/>
+          <w:i w:val="false"/>
           <w:color w:val="000000"/>
           <w:sz w:val="24"/>
           <w:szCs w:val="24"/>
@@ -1811,6 +1911,7 @@
         <w:rPr>
           <w:rFonts w:ascii="Times New Roman" w:cs="David" w:eastAsia="David" w:hAnsi="Times New Roman"/>
           <w:b w:val="false"/>
+          <w:i w:val="false"/>
           <w:color w:val="000000"/>
           <w:sz w:val="24"/>
           <w:szCs w:val="24"/>
@@ -1829,6 +1930,7 @@
         <w:rPr>
           <w:rFonts w:ascii="Times New Roman" w:cs="David" w:eastAsia="David" w:hAnsi="Times New Roman"/>
           <w:b w:val="false"/>
+          <w:i w:val="false"/>
           <w:color w:val="000000"/>
           <w:sz w:val="24"/>
           <w:szCs w:val="24"/>
@@ -1847,6 +1949,7 @@
         <w:rPr>
           <w:rFonts w:ascii="Times New Roman" w:cs="David" w:eastAsia="David" w:hAnsi="Times New Roman"/>
           <w:b w:val="false"/>
+          <w:i w:val="false"/>
           <w:color w:val="000000"/>
           <w:sz w:val="24"/>
           <w:szCs w:val="24"/>
@@ -1865,6 +1968,7 @@
         <w:rPr>
           <w:rFonts w:ascii="Times New Roman" w:cs="David" w:eastAsia="David" w:hAnsi="Times New Roman"/>
           <w:b w:val="false"/>
+          <w:i w:val="false"/>
           <w:color w:val="000000"/>
           <w:sz w:val="24"/>
           <w:szCs w:val="24"/>
@@ -1883,6 +1987,7 @@
         <w:rPr>
           <w:rFonts w:ascii="Times New Roman" w:cs="David" w:eastAsia="David" w:hAnsi="Times New Roman"/>
           <w:b w:val="false"/>
+          <w:i w:val="false"/>
           <w:color w:val="000000"/>
           <w:sz w:val="24"/>
           <w:szCs w:val="24"/>
@@ -1901,6 +2006,7 @@
         <w:rPr>
           <w:rFonts w:ascii="Times New Roman" w:cs="David" w:eastAsia="David" w:hAnsi="Times New Roman"/>
           <w:b w:val="false"/>
+          <w:i w:val="false"/>
           <w:color w:val="000000"/>
           <w:sz w:val="24"/>
           <w:szCs w:val="24"/>
@@ -1919,6 +2025,7 @@
         <w:rPr>
           <w:rFonts w:ascii="Times New Roman" w:cs="David" w:eastAsia="David" w:hAnsi="Times New Roman"/>
           <w:b w:val="false"/>
+          <w:i w:val="false"/>
           <w:color w:val="000000"/>
           <w:sz w:val="24"/>
           <w:szCs w:val="24"/>
@@ -1937,6 +2044,7 @@
         <w:rPr>
           <w:rFonts w:ascii="Times New Roman" w:cs="David" w:eastAsia="David" w:hAnsi="Times New Roman"/>
           <w:b w:val="false"/>
+          <w:i w:val="false"/>
           <w:color w:val="000000"/>
           <w:sz w:val="24"/>
           <w:szCs w:val="24"/>
@@ -1955,6 +2063,7 @@
         <w:rPr>
           <w:rFonts w:ascii="Times New Roman" w:cs="David" w:eastAsia="David" w:hAnsi="Times New Roman"/>
           <w:b w:val="false"/>
+          <w:i w:val="false"/>
           <w:color w:val="000000"/>
           <w:sz w:val="24"/>
           <w:szCs w:val="24"/>
@@ -1973,6 +2082,7 @@
         <w:rPr>
           <w:rFonts w:ascii="Times New Roman" w:cs="David" w:eastAsia="David" w:hAnsi="Times New Roman"/>
           <w:b w:val="false"/>
+          <w:i w:val="false"/>
           <w:color w:val="000000"/>
           <w:sz w:val="24"/>
           <w:szCs w:val="24"/>
@@ -1991,6 +2101,7 @@
         <w:rPr>
           <w:rFonts w:ascii="Times New Roman" w:cs="David" w:eastAsia="David" w:hAnsi="Times New Roman"/>
           <w:b w:val="false"/>
+          <w:i w:val="false"/>
           <w:color w:val="000000"/>
           <w:sz w:val="24"/>
           <w:szCs w:val="24"/>
@@ -2009,6 +2120,7 @@
         <w:rPr>
           <w:rFonts w:ascii="Times New Roman" w:cs="David" w:eastAsia="David" w:hAnsi="Times New Roman"/>
           <w:b w:val="false"/>
+          <w:i w:val="false"/>
           <w:color w:val="000000"/>
           <w:sz w:val="24"/>
           <w:szCs w:val="24"/>
@@ -2029,6 +2141,7 @@
           <w:rFonts w:ascii="Times New Roman" w:cs="David" w:eastAsia="David" w:hAnsi="Times New Roman"/>
           <w:b/>
           <w:bCs/>
+          <w:i w:val="false"/>
           <w:color w:val="000000"/>
           <w:sz w:val="28"/>
           <w:szCs w:val="28"/>
@@ -2047,6 +2160,7 @@
         <w:rPr>
           <w:rFonts w:ascii="Times New Roman" w:cs="David" w:eastAsia="David" w:hAnsi="Times New Roman"/>
           <w:b w:val="false"/>
+          <w:i w:val="false"/>
           <w:color w:val="000000"/>
           <w:sz w:val="24"/>
           <w:szCs w:val="24"/>
@@ -2065,6 +2179,7 @@
         <w:rPr>
           <w:rFonts w:ascii="Times New Roman" w:cs="David" w:eastAsia="David" w:hAnsi="Times New Roman"/>
           <w:b w:val="false"/>
+          <w:i w:val="false"/>
           <w:color w:val="000000"/>
           <w:sz w:val="24"/>
           <w:szCs w:val="24"/>
@@ -2083,6 +2198,7 @@
         <w:rPr>
           <w:rFonts w:ascii="Times New Roman" w:cs="David" w:eastAsia="David" w:hAnsi="Times New Roman"/>
           <w:b w:val="false"/>
+          <w:i w:val="false"/>
           <w:color w:val="000000"/>
           <w:sz w:val="24"/>
           <w:szCs w:val="24"/>
@@ -2101,6 +2217,7 @@
         <w:rPr>
           <w:rFonts w:ascii="Times New Roman" w:cs="David" w:eastAsia="David" w:hAnsi="Times New Roman"/>
           <w:b w:val="false"/>
+          <w:i w:val="false"/>
           <w:color w:val="000000"/>
           <w:sz w:val="24"/>
           <w:szCs w:val="24"/>
@@ -2119,6 +2236,7 @@
         <w:rPr>
           <w:rFonts w:ascii="Times New Roman" w:cs="David" w:eastAsia="David" w:hAnsi="Times New Roman"/>
           <w:b w:val="false"/>
+          <w:i w:val="false"/>
           <w:color w:val="000000"/>
           <w:sz w:val="24"/>
           <w:szCs w:val="24"/>
@@ -2137,6 +2255,7 @@
         <w:rPr>
           <w:rFonts w:ascii="Times New Roman" w:cs="David" w:eastAsia="David" w:hAnsi="Times New Roman"/>
           <w:b w:val="false"/>
+          <w:i w:val="false"/>
           <w:color w:val="000000"/>
           <w:sz w:val="24"/>
           <w:szCs w:val="24"/>
@@ -2155,6 +2274,7 @@
         <w:rPr>
           <w:rFonts w:ascii="Times New Roman" w:cs="David" w:eastAsia="David" w:hAnsi="Times New Roman"/>
           <w:b w:val="false"/>
+          <w:i w:val="false"/>
           <w:color w:val="000000"/>
           <w:sz w:val="24"/>
           <w:szCs w:val="24"/>
@@ -2173,6 +2293,7 @@
         <w:rPr>
           <w:rFonts w:ascii="Times New Roman" w:cs="David" w:eastAsia="David" w:hAnsi="Times New Roman"/>
           <w:b w:val="false"/>
+          <w:i w:val="false"/>
           <w:color w:val="000000"/>
           <w:sz w:val="24"/>
           <w:szCs w:val="24"/>
@@ -2191,6 +2312,7 @@
         <w:rPr>
           <w:rFonts w:ascii="Times New Roman" w:cs="David" w:eastAsia="David" w:hAnsi="Times New Roman"/>
           <w:b w:val="false"/>
+          <w:i w:val="false"/>
           <w:color w:val="000000"/>
           <w:sz w:val="24"/>
           <w:szCs w:val="24"/>
@@ -2209,6 +2331,7 @@
         <w:rPr>
           <w:rFonts w:ascii="Times New Roman" w:cs="David" w:eastAsia="David" w:hAnsi="Times New Roman"/>
           <w:b w:val="false"/>
+          <w:i w:val="false"/>
           <w:color w:val="000000"/>
           <w:sz w:val="24"/>
           <w:szCs w:val="24"/>
@@ -2227,6 +2350,7 @@
         <w:rPr>
           <w:rFonts w:ascii="Times New Roman" w:cs="David" w:eastAsia="David" w:hAnsi="Times New Roman"/>
           <w:b w:val="false"/>
+          <w:i w:val="false"/>
           <w:color w:val="000000"/>
           <w:sz w:val="24"/>
           <w:szCs w:val="24"/>
@@ -2245,6 +2369,7 @@
         <w:rPr>
           <w:rFonts w:ascii="Times New Roman" w:cs="David" w:eastAsia="David" w:hAnsi="Times New Roman"/>
           <w:b w:val="false"/>
+          <w:i w:val="false"/>
           <w:color w:val="000000"/>
           <w:sz w:val="24"/>
           <w:szCs w:val="24"/>
@@ -2263,6 +2388,7 @@
         <w:rPr>
           <w:rFonts w:ascii="Times New Roman" w:cs="David" w:eastAsia="David" w:hAnsi="Times New Roman"/>
           <w:b w:val="false"/>
+          <w:i w:val="false"/>
           <w:color w:val="000000"/>
           <w:sz w:val="24"/>
           <w:szCs w:val="24"/>
@@ -2281,6 +2407,7 @@
         <w:rPr>
           <w:rFonts w:ascii="Times New Roman" w:cs="David" w:eastAsia="David" w:hAnsi="Times New Roman"/>
           <w:b w:val="false"/>
+          <w:i w:val="false"/>
           <w:color w:val="000000"/>
           <w:sz w:val="24"/>
           <w:szCs w:val="24"/>
@@ -2299,6 +2426,7 @@
         <w:rPr>
           <w:rFonts w:ascii="Times New Roman" w:cs="David" w:eastAsia="David" w:hAnsi="Times New Roman"/>
           <w:b w:val="false"/>
+          <w:i w:val="false"/>
           <w:color w:val="000000"/>
           <w:sz w:val="24"/>
           <w:szCs w:val="24"/>
@@ -2317,6 +2445,7 @@
         <w:rPr>
           <w:rFonts w:ascii="Times New Roman" w:cs="David" w:eastAsia="David" w:hAnsi="Times New Roman"/>
           <w:b w:val="false"/>
+          <w:i w:val="false"/>
           <w:color w:val="000000"/>
           <w:sz w:val="24"/>
           <w:szCs w:val="24"/>
@@ -2338,6 +2467,7 @@
           <w:rFonts w:ascii="Times New Roman" w:cs="David" w:eastAsia="David" w:hAnsi="Times New Roman"/>
           <w:b/>
           <w:bCs/>
+          <w:i w:val="false"/>
           <w:color w:val="000000"/>
           <w:sz w:val="32"/>
           <w:szCs w:val="32"/>
@@ -2356,6 +2486,7 @@
         <w:rPr>
           <w:rFonts w:ascii="Times New Roman" w:cs="David" w:eastAsia="David" w:hAnsi="Times New Roman"/>
           <w:b w:val="false"/>
+          <w:i w:val="false"/>
           <w:color w:val="000000"/>
           <w:sz w:val="24"/>
           <w:szCs w:val="24"/>
@@ -2374,6 +2505,7 @@
         <w:rPr>
           <w:rFonts w:ascii="Times New Roman" w:cs="David" w:eastAsia="David" w:hAnsi="Times New Roman"/>
           <w:b w:val="false"/>
+          <w:i w:val="false"/>
           <w:color w:val="000000"/>
           <w:sz w:val="24"/>
           <w:szCs w:val="24"/>
@@ -2392,6 +2524,7 @@
         <w:rPr>
           <w:rFonts w:ascii="Times New Roman" w:cs="David" w:eastAsia="David" w:hAnsi="Times New Roman"/>
           <w:b w:val="false"/>
+          <w:i w:val="false"/>
           <w:color w:val="000000"/>
           <w:sz w:val="24"/>
           <w:szCs w:val="24"/>
@@ -2410,6 +2543,7 @@
         <w:rPr>
           <w:rFonts w:ascii="Times New Roman" w:cs="David" w:eastAsia="David" w:hAnsi="Times New Roman"/>
           <w:b w:val="false"/>
+          <w:i w:val="false"/>
           <w:color w:val="000000"/>
           <w:sz w:val="24"/>
           <w:szCs w:val="24"/>
@@ -2428,6 +2562,7 @@
         <w:rPr>
           <w:rFonts w:ascii="Times New Roman" w:cs="David" w:eastAsia="David" w:hAnsi="Times New Roman"/>
           <w:b w:val="false"/>
+          <w:i w:val="false"/>
           <w:color w:val="000000"/>
           <w:sz w:val="24"/>
           <w:szCs w:val="24"/>
@@ -2446,6 +2581,7 @@
         <w:rPr>
           <w:rFonts w:ascii="Times New Roman" w:cs="David" w:eastAsia="David" w:hAnsi="Times New Roman"/>
           <w:b w:val="false"/>
+          <w:i w:val="false"/>
           <w:color w:val="000000"/>
           <w:sz w:val="24"/>
           <w:szCs w:val="24"/>
@@ -2464,6 +2600,7 @@
         <w:rPr>
           <w:rFonts w:ascii="Times New Roman" w:cs="David" w:eastAsia="David" w:hAnsi="Times New Roman"/>
           <w:b w:val="false"/>
+          <w:i w:val="false"/>
           <w:color w:val="000000"/>
           <w:sz w:val="24"/>
           <w:szCs w:val="24"/>
@@ -2482,6 +2619,7 @@
         <w:rPr>
           <w:rFonts w:ascii="Times New Roman" w:cs="David" w:eastAsia="David" w:hAnsi="Times New Roman"/>
           <w:b w:val="false"/>
+          <w:i w:val="false"/>
           <w:color w:val="000000"/>
           <w:sz w:val="24"/>
           <w:szCs w:val="24"/>
@@ -2500,6 +2638,7 @@
         <w:rPr>
           <w:rFonts w:ascii="Times New Roman" w:cs="David" w:eastAsia="David" w:hAnsi="Times New Roman"/>
           <w:b w:val="false"/>
+          <w:i w:val="false"/>
           <w:color w:val="000000"/>
           <w:sz w:val="24"/>
           <w:szCs w:val="24"/>
@@ -2518,24 +2657,26 @@
         <w:rPr>
           <w:rFonts w:ascii="Times New Roman" w:cs="David" w:eastAsia="David" w:hAnsi="Times New Roman"/>
           <w:b w:val="false"/>
-          <w:color w:val="000000"/>
-          <w:sz w:val="24"/>
-          <w:szCs w:val="24"/>
-          <w:rtl/>
-        </w:rPr>
-        <w:t xml:space="preserve">לצד הפעולות הגלויות, ההתמודדות כוללת גם ויסות של האופן שבו המורה מפרש את התנהגות ההורה. מורים בוחנים אם ריחוק, שתיקה או פנייה תקיפה קשורים לחוסר עניין, או שמא לעומס, לחוויות קודמות מול מערכת החינוך, לפערי שפה ולתחושת חוסר ביטחון. פרשנות זו משפיעה על התגובה: במקום לראות בכל קושי איום על סמכותם, הם עשויים להתייחס אליו כביטוי של תנאי החיים ושל היחסים שנבנו עם בית הספר (Hornby &amp; Lafaele, 2011; Peleg &amp; Levy, 2023).</w:t>
-      </w:r>
-    </w:p>
-    <w:p>
-      <w:pPr>
-        <w:bidi/>
-        <w:spacing w:after="120" w:line="360"/>
-        <w:jc w:val="both"/>
-      </w:pPr>
-      <w:r>
-        <w:rPr>
-          <w:rFonts w:ascii="Times New Roman" w:cs="David" w:eastAsia="David" w:hAnsi="Times New Roman"/>
-          <w:b w:val="false"/>
+          <w:i w:val="false"/>
+          <w:color w:val="000000"/>
+          <w:sz w:val="24"/>
+          <w:szCs w:val="24"/>
+          <w:rtl/>
+        </w:rPr>
+        <w:t xml:space="preserve">לצד הפעולות הגלויות, ההתמודדות כוללת גם ויסות של האופן שבו המורה מפרש את התנהגות ההורה. מורים בוחנים אם ריחוק, שתיקה או פנייה תקיפה קשורים לחוסר עניין, או שמא לעומס, לחוויות קודמות מול מערכת החינוך, לפערי שפה ולתחושת חוסר ביטחון. פרשנות זו משפיעה על התגובה: במקום לראות בכל קושי איום על סמכותם, הם עשויים להתייחס אליו כביטוי של תנאי החיים ושל היחסים שנבנו עם בית הספר. כצנלסון (2014) מדגישה היבט תרבותי: הורים שבאו מתרבות שונה מזו של המורה עלולים לחוש שהמערכת אינה מבינה אותם, ולכן קריאה רגישה של התנהגותם היא תנאי לקשר עובד (Hornby &amp; Lafaele, 2011; Peleg &amp; Levy, 2023).</w:t>
+      </w:r>
+    </w:p>
+    <w:p>
+      <w:pPr>
+        <w:bidi/>
+        <w:spacing w:after="120" w:line="360"/>
+        <w:jc w:val="both"/>
+      </w:pPr>
+      <w:r>
+        <w:rPr>
+          <w:rFonts w:ascii="Times New Roman" w:cs="David" w:eastAsia="David" w:hAnsi="Times New Roman"/>
+          <w:b w:val="false"/>
+          <w:i w:val="false"/>
           <w:color w:val="000000"/>
           <w:sz w:val="24"/>
           <w:szCs w:val="24"/>
@@ -2554,6 +2695,7 @@
         <w:rPr>
           <w:rFonts w:ascii="Times New Roman" w:cs="David" w:eastAsia="David" w:hAnsi="Times New Roman"/>
           <w:b w:val="false"/>
+          <w:i w:val="false"/>
           <w:color w:val="000000"/>
           <w:sz w:val="24"/>
           <w:szCs w:val="24"/>
@@ -2572,6 +2714,7 @@
         <w:rPr>
           <w:rFonts w:ascii="Times New Roman" w:cs="David" w:eastAsia="David" w:hAnsi="Times New Roman"/>
           <w:b w:val="false"/>
+          <w:i w:val="false"/>
           <w:color w:val="000000"/>
           <w:sz w:val="24"/>
           <w:szCs w:val="24"/>
@@ -2590,6 +2733,7 @@
         <w:rPr>
           <w:rFonts w:ascii="Times New Roman" w:cs="David" w:eastAsia="David" w:hAnsi="Times New Roman"/>
           <w:b w:val="false"/>
+          <w:i w:val="false"/>
           <w:color w:val="000000"/>
           <w:sz w:val="24"/>
           <w:szCs w:val="24"/>
@@ -2608,6 +2752,7 @@
         <w:rPr>
           <w:rFonts w:ascii="Times New Roman" w:cs="David" w:eastAsia="David" w:hAnsi="Times New Roman"/>
           <w:b w:val="false"/>
+          <w:i w:val="false"/>
           <w:color w:val="000000"/>
           <w:sz w:val="24"/>
           <w:szCs w:val="24"/>
@@ -2626,6 +2771,7 @@
         <w:rPr>
           <w:rFonts w:ascii="Times New Roman" w:cs="David" w:eastAsia="David" w:hAnsi="Times New Roman"/>
           <w:b w:val="false"/>
+          <w:i w:val="false"/>
           <w:color w:val="000000"/>
           <w:sz w:val="24"/>
           <w:szCs w:val="24"/>
@@ -2644,6 +2790,7 @@
         <w:rPr>
           <w:rFonts w:ascii="Times New Roman" w:cs="David" w:eastAsia="David" w:hAnsi="Times New Roman"/>
           <w:b w:val="false"/>
+          <w:i w:val="false"/>
           <w:color w:val="000000"/>
           <w:sz w:val="24"/>
           <w:szCs w:val="24"/>
@@ -2662,6 +2809,7 @@
         <w:rPr>
           <w:rFonts w:ascii="Times New Roman" w:cs="David" w:eastAsia="David" w:hAnsi="Times New Roman"/>
           <w:b w:val="false"/>
+          <w:i w:val="false"/>
           <w:color w:val="000000"/>
           <w:sz w:val="24"/>
           <w:szCs w:val="24"/>
@@ -2680,6 +2828,7 @@
         <w:rPr>
           <w:rFonts w:ascii="Times New Roman" w:cs="David" w:eastAsia="David" w:hAnsi="Times New Roman"/>
           <w:b w:val="false"/>
+          <w:i w:val="false"/>
           <w:color w:val="000000"/>
           <w:sz w:val="24"/>
           <w:szCs w:val="24"/>
@@ -2698,6 +2847,7 @@
         <w:rPr>
           <w:rFonts w:ascii="Times New Roman" w:cs="David" w:eastAsia="David" w:hAnsi="Times New Roman"/>
           <w:b w:val="false"/>
+          <w:i w:val="false"/>
           <w:color w:val="000000"/>
           <w:sz w:val="24"/>
           <w:szCs w:val="24"/>
@@ -2716,6 +2866,7 @@
         <w:rPr>
           <w:rFonts w:ascii="Times New Roman" w:cs="David" w:eastAsia="David" w:hAnsi="Times New Roman"/>
           <w:b w:val="false"/>
+          <w:i w:val="false"/>
           <w:color w:val="000000"/>
           <w:sz w:val="24"/>
           <w:szCs w:val="24"/>
@@ -2737,6 +2888,7 @@
           <w:rFonts w:ascii="Times New Roman" w:cs="David" w:eastAsia="David" w:hAnsi="Times New Roman"/>
           <w:b/>
           <w:bCs/>
+          <w:i w:val="false"/>
           <w:color w:val="000000"/>
           <w:sz w:val="32"/>
           <w:szCs w:val="32"/>
@@ -2755,6 +2907,7 @@
         <w:rPr>
           <w:rFonts w:ascii="Times New Roman" w:cs="David" w:eastAsia="David" w:hAnsi="Times New Roman"/>
           <w:b w:val="false"/>
+          <w:i w:val="false"/>
           <w:color w:val="000000"/>
           <w:sz w:val="24"/>
           <w:szCs w:val="24"/>
@@ -2774,6 +2927,7 @@
           <w:rFonts w:ascii="Times New Roman" w:cs="David" w:eastAsia="David" w:hAnsi="Times New Roman"/>
           <w:b/>
           <w:bCs/>
+          <w:i w:val="false"/>
           <w:color w:val="000000"/>
           <w:sz w:val="24"/>
           <w:szCs w:val="24"/>
@@ -2792,6 +2946,7 @@
         <w:rPr>
           <w:rFonts w:ascii="Times New Roman" w:cs="David" w:eastAsia="David" w:hAnsi="Times New Roman"/>
           <w:b w:val="false"/>
+          <w:i w:val="false"/>
           <w:color w:val="000000"/>
           <w:sz w:val="24"/>
           <w:szCs w:val="24"/>
@@ -2810,6 +2965,7 @@
         <w:rPr>
           <w:rFonts w:ascii="Times New Roman" w:cs="David" w:eastAsia="David" w:hAnsi="Times New Roman"/>
           <w:b w:val="false"/>
+          <w:i w:val="false"/>
           <w:color w:val="000000"/>
           <w:sz w:val="24"/>
           <w:szCs w:val="24"/>
@@ -2828,6 +2984,7 @@
         <w:rPr>
           <w:rFonts w:ascii="Times New Roman" w:cs="David" w:eastAsia="David" w:hAnsi="Times New Roman"/>
           <w:b w:val="false"/>
+          <w:i w:val="false"/>
           <w:color w:val="000000"/>
           <w:sz w:val="24"/>
           <w:szCs w:val="24"/>
@@ -2846,6 +3003,7 @@
         <w:rPr>
           <w:rFonts w:ascii="Times New Roman" w:cs="David" w:eastAsia="David" w:hAnsi="Times New Roman"/>
           <w:b w:val="false"/>
+          <w:i w:val="false"/>
           <w:color w:val="000000"/>
           <w:sz w:val="24"/>
           <w:szCs w:val="24"/>
@@ -2865,6 +3023,7 @@
           <w:rFonts w:ascii="Times New Roman" w:cs="David" w:eastAsia="David" w:hAnsi="Times New Roman"/>
           <w:b/>
           <w:bCs/>
+          <w:i w:val="false"/>
           <w:color w:val="000000"/>
           <w:sz w:val="24"/>
           <w:szCs w:val="24"/>
@@ -2883,6 +3042,7 @@
         <w:rPr>
           <w:rFonts w:ascii="Times New Roman" w:cs="David" w:eastAsia="David" w:hAnsi="Times New Roman"/>
           <w:b w:val="false"/>
+          <w:i w:val="false"/>
           <w:color w:val="000000"/>
           <w:sz w:val="24"/>
           <w:szCs w:val="24"/>
@@ -2901,6 +3061,7 @@
         <w:rPr>
           <w:rFonts w:ascii="Times New Roman" w:cs="David" w:eastAsia="David" w:hAnsi="Times New Roman"/>
           <w:b w:val="false"/>
+          <w:i w:val="false"/>
           <w:color w:val="000000"/>
           <w:sz w:val="24"/>
           <w:szCs w:val="24"/>
@@ -2919,6 +3080,7 @@
         <w:rPr>
           <w:rFonts w:ascii="Times New Roman" w:cs="David" w:eastAsia="David" w:hAnsi="Times New Roman"/>
           <w:b w:val="false"/>
+          <w:i w:val="false"/>
           <w:color w:val="000000"/>
           <w:sz w:val="24"/>
           <w:szCs w:val="24"/>
@@ -2937,6 +3099,7 @@
         <w:rPr>
           <w:rFonts w:ascii="Times New Roman" w:cs="David" w:eastAsia="David" w:hAnsi="Times New Roman"/>
           <w:b w:val="false"/>
+          <w:i w:val="false"/>
           <w:color w:val="000000"/>
           <w:sz w:val="24"/>
           <w:szCs w:val="24"/>
@@ -2955,6 +3118,7 @@
         <w:rPr>
           <w:rFonts w:ascii="Times New Roman" w:cs="David" w:eastAsia="David" w:hAnsi="Times New Roman"/>
           <w:b w:val="false"/>
+          <w:i w:val="false"/>
           <w:color w:val="000000"/>
           <w:sz w:val="24"/>
           <w:szCs w:val="24"/>
@@ -2974,6 +3138,7 @@
           <w:rFonts w:ascii="Times New Roman" w:cs="David" w:eastAsia="David" w:hAnsi="Times New Roman"/>
           <w:b/>
           <w:bCs/>
+          <w:i w:val="false"/>
           <w:color w:val="000000"/>
           <w:sz w:val="24"/>
           <w:szCs w:val="24"/>
@@ -2992,6 +3157,7 @@
         <w:rPr>
           <w:rFonts w:ascii="Times New Roman" w:cs="David" w:eastAsia="David" w:hAnsi="Times New Roman"/>
           <w:b w:val="false"/>
+          <w:i w:val="false"/>
           <w:color w:val="000000"/>
           <w:sz w:val="24"/>
           <w:szCs w:val="24"/>
@@ -3010,6 +3176,7 @@
         <w:rPr>
           <w:rFonts w:ascii="Times New Roman" w:cs="David" w:eastAsia="David" w:hAnsi="Times New Roman"/>
           <w:b w:val="false"/>
+          <w:i w:val="false"/>
           <w:color w:val="000000"/>
           <w:sz w:val="24"/>
           <w:szCs w:val="24"/>
@@ -3028,6 +3195,7 @@
         <w:rPr>
           <w:rFonts w:ascii="Times New Roman" w:cs="David" w:eastAsia="David" w:hAnsi="Times New Roman"/>
           <w:b w:val="false"/>
+          <w:i w:val="false"/>
           <w:color w:val="000000"/>
           <w:sz w:val="24"/>
           <w:szCs w:val="24"/>
@@ -3047,6 +3215,7 @@
           <w:rFonts w:ascii="Times New Roman" w:cs="David" w:eastAsia="David" w:hAnsi="Times New Roman"/>
           <w:b/>
           <w:bCs/>
+          <w:i w:val="false"/>
           <w:color w:val="000000"/>
           <w:sz w:val="24"/>
           <w:szCs w:val="24"/>
@@ -3065,6 +3234,7 @@
         <w:rPr>
           <w:rFonts w:ascii="Times New Roman" w:cs="David" w:eastAsia="David" w:hAnsi="Times New Roman"/>
           <w:b w:val="false"/>
+          <w:i w:val="false"/>
           <w:color w:val="000000"/>
           <w:sz w:val="24"/>
           <w:szCs w:val="24"/>
@@ -3083,6 +3253,7 @@
         <w:rPr>
           <w:rFonts w:ascii="Times New Roman" w:cs="David" w:eastAsia="David" w:hAnsi="Times New Roman"/>
           <w:b w:val="false"/>
+          <w:i w:val="false"/>
           <w:color w:val="000000"/>
           <w:sz w:val="24"/>
           <w:szCs w:val="24"/>
@@ -3101,6 +3272,7 @@
         <w:rPr>
           <w:rFonts w:ascii="Times New Roman" w:cs="David" w:eastAsia="David" w:hAnsi="Times New Roman"/>
           <w:b w:val="false"/>
+          <w:i w:val="false"/>
           <w:color w:val="000000"/>
           <w:sz w:val="24"/>
           <w:szCs w:val="24"/>
@@ -3120,6 +3292,7 @@
           <w:rFonts w:ascii="Times New Roman" w:cs="David" w:eastAsia="David" w:hAnsi="Times New Roman"/>
           <w:b/>
           <w:bCs/>
+          <w:i w:val="false"/>
           <w:color w:val="000000"/>
           <w:sz w:val="24"/>
           <w:szCs w:val="24"/>
@@ -3138,6 +3311,7 @@
         <w:rPr>
           <w:rFonts w:ascii="Times New Roman" w:cs="David" w:eastAsia="David" w:hAnsi="Times New Roman"/>
           <w:b w:val="false"/>
+          <w:i w:val="false"/>
           <w:color w:val="000000"/>
           <w:sz w:val="24"/>
           <w:szCs w:val="24"/>
@@ -3156,6 +3330,7 @@
         <w:rPr>
           <w:rFonts w:ascii="Times New Roman" w:cs="David" w:eastAsia="David" w:hAnsi="Times New Roman"/>
           <w:b w:val="false"/>
+          <w:i w:val="false"/>
           <w:color w:val="000000"/>
           <w:sz w:val="24"/>
           <w:szCs w:val="24"/>
@@ -3174,6 +3349,7 @@
         <w:rPr>
           <w:rFonts w:ascii="Times New Roman" w:cs="David" w:eastAsia="David" w:hAnsi="Times New Roman"/>
           <w:b w:val="false"/>
+          <w:i w:val="false"/>
           <w:color w:val="000000"/>
           <w:sz w:val="24"/>
           <w:szCs w:val="24"/>
@@ -3192,6 +3368,7 @@
         <w:rPr>
           <w:rFonts w:ascii="Times New Roman" w:cs="David" w:eastAsia="David" w:hAnsi="Times New Roman"/>
           <w:b w:val="false"/>
+          <w:i w:val="false"/>
           <w:color w:val="000000"/>
           <w:sz w:val="24"/>
           <w:szCs w:val="24"/>
@@ -3211,6 +3388,7 @@
           <w:rFonts w:ascii="Times New Roman" w:cs="David" w:eastAsia="David" w:hAnsi="Times New Roman"/>
           <w:b/>
           <w:bCs/>
+          <w:i w:val="false"/>
           <w:color w:val="000000"/>
           <w:sz w:val="24"/>
           <w:szCs w:val="24"/>
@@ -3229,6 +3407,7 @@
         <w:rPr>
           <w:rFonts w:ascii="Times New Roman" w:cs="David" w:eastAsia="David" w:hAnsi="Times New Roman"/>
           <w:b w:val="false"/>
+          <w:i w:val="false"/>
           <w:color w:val="000000"/>
           <w:sz w:val="24"/>
           <w:szCs w:val="24"/>
@@ -3248,6 +3427,7 @@
           <w:rFonts w:ascii="Times New Roman" w:cs="David" w:eastAsia="David" w:hAnsi="Times New Roman"/>
           <w:b/>
           <w:bCs/>
+          <w:i w:val="false"/>
           <w:color w:val="000000"/>
           <w:sz w:val="24"/>
           <w:szCs w:val="24"/>
@@ -3266,6 +3446,7 @@
         <w:rPr>
           <w:rFonts w:ascii="Times New Roman" w:cs="David" w:eastAsia="David" w:hAnsi="Times New Roman"/>
           <w:b w:val="false"/>
+          <w:i w:val="false"/>
           <w:color w:val="000000"/>
           <w:sz w:val="24"/>
           <w:szCs w:val="24"/>
@@ -3284,6 +3465,7 @@
         <w:rPr>
           <w:rFonts w:ascii="Times New Roman" w:cs="David" w:eastAsia="David" w:hAnsi="Times New Roman"/>
           <w:b w:val="false"/>
+          <w:i w:val="false"/>
           <w:color w:val="000000"/>
           <w:sz w:val="24"/>
           <w:szCs w:val="24"/>
@@ -3302,6 +3484,7 @@
         <w:rPr>
           <w:rFonts w:ascii="Times New Roman" w:cs="David" w:eastAsia="David" w:hAnsi="Times New Roman"/>
           <w:b w:val="false"/>
+          <w:i w:val="false"/>
           <w:color w:val="000000"/>
           <w:sz w:val="24"/>
           <w:szCs w:val="24"/>
@@ -3321,6 +3504,7 @@
           <w:rFonts w:ascii="Times New Roman" w:cs="David" w:eastAsia="David" w:hAnsi="Times New Roman"/>
           <w:b/>
           <w:bCs/>
+          <w:i w:val="false"/>
           <w:color w:val="000000"/>
           <w:sz w:val="24"/>
           <w:szCs w:val="24"/>
@@ -3339,6 +3523,7 @@
         <w:rPr>
           <w:rFonts w:ascii="Times New Roman" w:cs="David" w:eastAsia="David" w:hAnsi="Times New Roman"/>
           <w:b w:val="false"/>
+          <w:i w:val="false"/>
           <w:color w:val="000000"/>
           <w:sz w:val="24"/>
           <w:szCs w:val="24"/>
@@ -3357,6 +3542,7 @@
         <w:rPr>
           <w:rFonts w:ascii="Times New Roman" w:cs="David" w:eastAsia="David" w:hAnsi="Times New Roman"/>
           <w:b w:val="false"/>
+          <w:i w:val="false"/>
           <w:color w:val="000000"/>
           <w:sz w:val="24"/>
           <w:szCs w:val="24"/>
@@ -3375,6 +3561,7 @@
         <w:rPr>
           <w:rFonts w:ascii="Times New Roman" w:cs="David" w:eastAsia="David" w:hAnsi="Times New Roman"/>
           <w:b w:val="false"/>
+          <w:i w:val="false"/>
           <w:color w:val="000000"/>
           <w:sz w:val="24"/>
           <w:szCs w:val="24"/>
@@ -3396,6 +3583,7 @@
           <w:rFonts w:ascii="Times New Roman" w:cs="David" w:eastAsia="David" w:hAnsi="Times New Roman"/>
           <w:b/>
           <w:bCs/>
+          <w:i w:val="false"/>
           <w:color w:val="000000"/>
           <w:sz w:val="32"/>
           <w:szCs w:val="32"/>
@@ -3415,12 +3603,218 @@
         <w:rPr>
           <w:rFonts w:ascii="Times New Roman" w:cs="David" w:eastAsia="David" w:hAnsi="Times New Roman"/>
           <w:b w:val="false"/>
-          <w:color w:val="000000"/>
-          <w:sz w:val="24"/>
-          <w:szCs w:val="24"/>
-          <w:rtl/>
-        </w:rPr>
-        <w:t xml:space="preserve">אדי-רקח, א', וגרינשטיין, י' (2016). יחסי מורים-הורים בבית הספר: סוגי הון כמסגרת לבחינת מעורבות הורים בבית הספר. בתוך חומרי הקורס פעילות גומלין בכיתה (10328). האוניברסיטה הפתוחה.</w:t>
+          <w:i w:val="false"/>
+          <w:color w:val="000000"/>
+          <w:sz w:val="24"/>
+          <w:szCs w:val="24"/>
+          <w:rtl/>
+        </w:rPr>
+        <w:t xml:space="preserve">אדי-רקח, א', וגרינשטיין, י' (2016). יחסי מורים-הורים בבית הספר: סוגי הון כמסגרת לבחינת מעורבות הורים בבית הספר. בתוך </w:t>
+      </w:r>
+      <w:r>
+        <w:rPr>
+          <w:rFonts w:ascii="Times New Roman" w:cs="David" w:eastAsia="David" w:hAnsi="Times New Roman"/>
+          <w:b w:val="false"/>
+          <w:i/>
+          <w:iCs/>
+          <w:color w:val="000000"/>
+          <w:sz w:val="24"/>
+          <w:szCs w:val="24"/>
+          <w:rtl/>
+        </w:rPr>
+        <w:t xml:space="preserve">חומרי הקורס פעילות גומלין בכיתה (10328)</w:t>
+      </w:r>
+      <w:r>
+        <w:rPr>
+          <w:rFonts w:ascii="Times New Roman" w:cs="David" w:eastAsia="David" w:hAnsi="Times New Roman"/>
+          <w:b w:val="false"/>
+          <w:i w:val="false"/>
+          <w:color w:val="000000"/>
+          <w:sz w:val="24"/>
+          <w:szCs w:val="24"/>
+          <w:rtl/>
+        </w:rPr>
+        <w:t xml:space="preserve">. האוניברסיטה הפתוחה.</w:t>
+      </w:r>
+    </w:p>
+    <w:p>
+      <w:pPr>
+        <w:bidi/>
+        <w:spacing w:after="200" w:line="360"/>
+        <w:ind w:start="709" w:hanging="709"/>
+        <w:jc w:val="start"/>
+      </w:pPr>
+      <w:r>
+        <w:rPr>
+          <w:rFonts w:ascii="Times New Roman" w:cs="David" w:eastAsia="David" w:hAnsi="Times New Roman"/>
+          <w:b w:val="false"/>
+          <w:i w:val="false"/>
+          <w:color w:val="000000"/>
+          <w:sz w:val="24"/>
+          <w:szCs w:val="24"/>
+          <w:rtl/>
+        </w:rPr>
+        <w:t xml:space="preserve">כצנלסון, ע' (2014, אוקטובר). קשר בין הורים ומערכת החינוך של ילדיהם. </w:t>
+      </w:r>
+      <w:r>
+        <w:rPr>
+          <w:rFonts w:ascii="Times New Roman" w:cs="David" w:eastAsia="David" w:hAnsi="Times New Roman"/>
+          <w:b w:val="false"/>
+          <w:i/>
+          <w:iCs/>
+          <w:color w:val="000000"/>
+          <w:sz w:val="24"/>
+          <w:szCs w:val="24"/>
+          <w:rtl/>
+        </w:rPr>
+        <w:t xml:space="preserve">פסיכואקטואליה</w:t>
+      </w:r>
+      <w:r>
+        <w:rPr>
+          <w:rFonts w:ascii="Times New Roman" w:cs="David" w:eastAsia="David" w:hAnsi="Times New Roman"/>
+          <w:b w:val="false"/>
+          <w:i w:val="false"/>
+          <w:color w:val="000000"/>
+          <w:sz w:val="24"/>
+          <w:szCs w:val="24"/>
+          <w:rtl/>
+        </w:rPr>
+        <w:t xml:space="preserve">.</w:t>
+      </w:r>
+    </w:p>
+    <w:p>
+      <w:pPr>
+        <w:bidi/>
+        <w:spacing w:after="200" w:line="360"/>
+        <w:ind w:start="709" w:hanging="709"/>
+        <w:jc w:val="start"/>
+      </w:pPr>
+      <w:r>
+        <w:rPr>
+          <w:rFonts w:ascii="Times New Roman" w:cs="David" w:eastAsia="David" w:hAnsi="Times New Roman"/>
+          <w:b w:val="false"/>
+          <w:i w:val="false"/>
+          <w:color w:val="000000"/>
+          <w:sz w:val="24"/>
+          <w:szCs w:val="24"/>
+          <w:rtl/>
+        </w:rPr>
+        <w:t xml:space="preserve">משיח, א' (2023). מעורבות הורים בחינוך ילדיהם כפונקציה של גודל המשפחה: המקרה של ישראל. </w:t>
+      </w:r>
+      <w:r>
+        <w:rPr>
+          <w:rFonts w:ascii="Times New Roman" w:cs="David" w:eastAsia="David" w:hAnsi="Times New Roman"/>
+          <w:b w:val="false"/>
+          <w:i/>
+          <w:iCs/>
+          <w:color w:val="000000"/>
+          <w:sz w:val="24"/>
+          <w:szCs w:val="24"/>
+          <w:rtl/>
+        </w:rPr>
+        <w:t xml:space="preserve">הלאה, 4</w:t>
+      </w:r>
+      <w:r>
+        <w:rPr>
+          <w:rFonts w:ascii="Times New Roman" w:cs="David" w:eastAsia="David" w:hAnsi="Times New Roman"/>
+          <w:b w:val="false"/>
+          <w:i w:val="false"/>
+          <w:color w:val="000000"/>
+          <w:sz w:val="24"/>
+          <w:szCs w:val="24"/>
+          <w:rtl/>
+        </w:rPr>
+        <w:t xml:space="preserve">, 13-30.</w:t>
+      </w:r>
+    </w:p>
+    <w:p>
+      <w:pPr>
+        <w:bidi/>
+        <w:spacing w:after="200" w:line="360"/>
+        <w:ind w:start="709" w:hanging="709"/>
+        <w:jc w:val="start"/>
+      </w:pPr>
+      <w:r>
+        <w:rPr>
+          <w:rFonts w:ascii="Times New Roman" w:cs="David" w:eastAsia="David" w:hAnsi="Times New Roman"/>
+          <w:b w:val="false"/>
+          <w:i w:val="false"/>
+          <w:color w:val="000000"/>
+          <w:sz w:val="24"/>
+          <w:szCs w:val="24"/>
+          <w:rtl/>
+        </w:rPr>
+        <w:t xml:space="preserve">פישר, י', ופרידמן, י' (2009). ההורים ובית הספר: יחסי גומלין ומעורבות. </w:t>
+      </w:r>
+      <w:r>
+        <w:rPr>
+          <w:rFonts w:ascii="Times New Roman" w:cs="David" w:eastAsia="David" w:hAnsi="Times New Roman"/>
+          <w:b w:val="false"/>
+          <w:i/>
+          <w:iCs/>
+          <w:color w:val="000000"/>
+          <w:sz w:val="24"/>
+          <w:szCs w:val="24"/>
+          <w:rtl/>
+        </w:rPr>
+        <w:t xml:space="preserve">דפים, 47</w:t>
+      </w:r>
+      <w:r>
+        <w:rPr>
+          <w:rFonts w:ascii="Times New Roman" w:cs="David" w:eastAsia="David" w:hAnsi="Times New Roman"/>
+          <w:b w:val="false"/>
+          <w:i w:val="false"/>
+          <w:color w:val="000000"/>
+          <w:sz w:val="24"/>
+          <w:szCs w:val="24"/>
+          <w:rtl/>
+        </w:rPr>
+        <w:t xml:space="preserve">, 11-37.</w:t>
+      </w:r>
+    </w:p>
+    <w:p>
+      <w:pPr>
+        <w:bidi/>
+        <w:spacing w:after="200" w:line="360"/>
+        <w:ind w:start="709" w:hanging="709"/>
+        <w:jc w:val="start"/>
+      </w:pPr>
+      <w:r>
+        <w:rPr>
+          <w:rFonts w:ascii="Times New Roman" w:cs="David" w:eastAsia="David" w:hAnsi="Times New Roman"/>
+          <w:b w:val="false"/>
+          <w:i w:val="false"/>
+          <w:color w:val="000000"/>
+          <w:sz w:val="24"/>
+          <w:szCs w:val="24"/>
+          <w:rtl/>
+        </w:rPr>
+        <w:t xml:space="preserve">פרידמן, י' (2011). יחסי בית ספר-הורים בישראל. </w:t>
+      </w:r>
+      <w:r>
+        <w:rPr>
+          <w:rFonts w:ascii="Times New Roman" w:cs="David" w:eastAsia="David" w:hAnsi="Times New Roman"/>
+          <w:b w:val="false"/>
+          <w:i/>
+          <w:iCs/>
+          <w:color w:val="000000"/>
+          <w:sz w:val="24"/>
+          <w:szCs w:val="24"/>
+          <w:rtl/>
+        </w:rPr>
+        <w:t xml:space="preserve">עיונים במינהל ובארגון החינוך, 32</w:t>
+      </w:r>
+      <w:r>
+        <w:rPr>
+          <w:rFonts w:ascii="Times New Roman" w:cs="David" w:eastAsia="David" w:hAnsi="Times New Roman"/>
+          <w:b w:val="false"/>
+          <w:i w:val="false"/>
+          <w:color w:val="000000"/>
+          <w:sz w:val="24"/>
+          <w:szCs w:val="24"/>
+          <w:rtl/>
+        </w:rPr>
+        <w:t xml:space="preserve">, 237-267.</w:t>
       </w:r>
     </w:p>
     <w:p>
@@ -3433,11 +3827,35 @@
         <w:rPr>
           <w:rFonts w:ascii="Times New Roman" w:cs="David" w:eastAsia="David" w:hAnsi="Times New Roman"/>
           <w:b w:val="false"/>
-          <w:color w:val="000000"/>
-          <w:sz w:val="24"/>
-          <w:szCs w:val="24"/>
-        </w:rPr>
-        <w:t xml:space="preserve">Fisher, Y., &amp; Refael Fanyo, R. (2022). Parents' perceptions of teachers' authority and parental involvement: The impact of communality. Frontiers in Psychology, 13, Article 908290. https://doi.org/10.3389/fpsyg.2022.908290</w:t>
+          <w:i w:val="false"/>
+          <w:color w:val="000000"/>
+          <w:sz w:val="24"/>
+          <w:szCs w:val="24"/>
+        </w:rPr>
+        <w:t xml:space="preserve">Fisher, Y., &amp; Refael Fanyo, R. (2022). Parents' perceptions of teachers' authority and parental involvement: The impact of communality. </w:t>
+      </w:r>
+      <w:r>
+        <w:rPr>
+          <w:rFonts w:ascii="Times New Roman" w:cs="David" w:eastAsia="David" w:hAnsi="Times New Roman"/>
+          <w:b w:val="false"/>
+          <w:i/>
+          <w:iCs/>
+          <w:color w:val="000000"/>
+          <w:sz w:val="24"/>
+          <w:szCs w:val="24"/>
+        </w:rPr>
+        <w:t xml:space="preserve">Frontiers in Psychology, 13</w:t>
+      </w:r>
+      <w:r>
+        <w:rPr>
+          <w:rFonts w:ascii="Times New Roman" w:cs="David" w:eastAsia="David" w:hAnsi="Times New Roman"/>
+          <w:b w:val="false"/>
+          <w:i w:val="false"/>
+          <w:color w:val="000000"/>
+          <w:sz w:val="24"/>
+          <w:szCs w:val="24"/>
+        </w:rPr>
+        <w:t xml:space="preserve">, Article 908290. https://doi.org/10.3389/fpsyg.2022.908290</w:t>
       </w:r>
     </w:p>
     <w:p>
@@ -3450,11 +3868,35 @@
         <w:rPr>
           <w:rFonts w:ascii="Times New Roman" w:cs="David" w:eastAsia="David" w:hAnsi="Times New Roman"/>
           <w:b w:val="false"/>
-          <w:color w:val="000000"/>
-          <w:sz w:val="24"/>
-          <w:szCs w:val="24"/>
-        </w:rPr>
-        <w:t xml:space="preserve">Gitonga, D. M. (2023). Level of parental involvement in type 1-6 of Epstein typologies in the current school practices based on grade groups A, B, and C. Journal of Research Innovation and Implications in Education, 7(1), 219-237.</w:t>
+          <w:i w:val="false"/>
+          <w:color w:val="000000"/>
+          <w:sz w:val="24"/>
+          <w:szCs w:val="24"/>
+        </w:rPr>
+        <w:t xml:space="preserve">Gitonga, D. M. (2023). Level of parental involvement in type 1-6 of Epstein typologies in the current school practices based on grade groups A, B, and C. </w:t>
+      </w:r>
+      <w:r>
+        <w:rPr>
+          <w:rFonts w:ascii="Times New Roman" w:cs="David" w:eastAsia="David" w:hAnsi="Times New Roman"/>
+          <w:b w:val="false"/>
+          <w:i/>
+          <w:iCs/>
+          <w:color w:val="000000"/>
+          <w:sz w:val="24"/>
+          <w:szCs w:val="24"/>
+        </w:rPr>
+        <w:t xml:space="preserve">Journal of Research Innovation and Implications in Education, 7</w:t>
+      </w:r>
+      <w:r>
+        <w:rPr>
+          <w:rFonts w:ascii="Times New Roman" w:cs="David" w:eastAsia="David" w:hAnsi="Times New Roman"/>
+          <w:b w:val="false"/>
+          <w:i w:val="false"/>
+          <w:color w:val="000000"/>
+          <w:sz w:val="24"/>
+          <w:szCs w:val="24"/>
+        </w:rPr>
+        <w:t xml:space="preserve">(1), 219-237.</w:t>
       </w:r>
     </w:p>
     <w:p>
@@ -3467,11 +3909,35 @@
         <w:rPr>
           <w:rFonts w:ascii="Times New Roman" w:cs="David" w:eastAsia="David" w:hAnsi="Times New Roman"/>
           <w:b w:val="false"/>
-          <w:color w:val="000000"/>
-          <w:sz w:val="24"/>
-          <w:szCs w:val="24"/>
-        </w:rPr>
-        <w:t xml:space="preserve">Goodall, J. (2022). A framework for family engagement: Going beyond the Epstein framework. Wales Journal of Education, 24(2), 74-96. https://doi.org/10.16922/wje.24.2.5</w:t>
+          <w:i w:val="false"/>
+          <w:color w:val="000000"/>
+          <w:sz w:val="24"/>
+          <w:szCs w:val="24"/>
+        </w:rPr>
+        <w:t xml:space="preserve">Goodall, J. (2022). A framework for family engagement: Going beyond the Epstein framework. </w:t>
+      </w:r>
+      <w:r>
+        <w:rPr>
+          <w:rFonts w:ascii="Times New Roman" w:cs="David" w:eastAsia="David" w:hAnsi="Times New Roman"/>
+          <w:b w:val="false"/>
+          <w:i/>
+          <w:iCs/>
+          <w:color w:val="000000"/>
+          <w:sz w:val="24"/>
+          <w:szCs w:val="24"/>
+        </w:rPr>
+        <w:t xml:space="preserve">Wales Journal of Education, 24</w:t>
+      </w:r>
+      <w:r>
+        <w:rPr>
+          <w:rFonts w:ascii="Times New Roman" w:cs="David" w:eastAsia="David" w:hAnsi="Times New Roman"/>
+          <w:b w:val="false"/>
+          <w:i w:val="false"/>
+          <w:color w:val="000000"/>
+          <w:sz w:val="24"/>
+          <w:szCs w:val="24"/>
+        </w:rPr>
+        <w:t xml:space="preserve">(2), 74-96. https://doi.org/10.16922/wje.24.2.5</w:t>
       </w:r>
     </w:p>
     <w:p>
@@ -3484,11 +3950,35 @@
         <w:rPr>
           <w:rFonts w:ascii="Times New Roman" w:cs="David" w:eastAsia="David" w:hAnsi="Times New Roman"/>
           <w:b w:val="false"/>
-          <w:color w:val="000000"/>
-          <w:sz w:val="24"/>
-          <w:szCs w:val="24"/>
-        </w:rPr>
-        <w:t xml:space="preserve">Graham-Clay, S. (2024). Communicating with parents 2.0: Strategies for teachers. School Community Journal, 34(1), 9-60.</w:t>
+          <w:i w:val="false"/>
+          <w:color w:val="000000"/>
+          <w:sz w:val="24"/>
+          <w:szCs w:val="24"/>
+        </w:rPr>
+        <w:t xml:space="preserve">Graham-Clay, S. (2024). Communicating with parents 2.0: Strategies for teachers. </w:t>
+      </w:r>
+      <w:r>
+        <w:rPr>
+          <w:rFonts w:ascii="Times New Roman" w:cs="David" w:eastAsia="David" w:hAnsi="Times New Roman"/>
+          <w:b w:val="false"/>
+          <w:i/>
+          <w:iCs/>
+          <w:color w:val="000000"/>
+          <w:sz w:val="24"/>
+          <w:szCs w:val="24"/>
+        </w:rPr>
+        <w:t xml:space="preserve">School Community Journal, 34</w:t>
+      </w:r>
+      <w:r>
+        <w:rPr>
+          <w:rFonts w:ascii="Times New Roman" w:cs="David" w:eastAsia="David" w:hAnsi="Times New Roman"/>
+          <w:b w:val="false"/>
+          <w:i w:val="false"/>
+          <w:color w:val="000000"/>
+          <w:sz w:val="24"/>
+          <w:szCs w:val="24"/>
+        </w:rPr>
+        <w:t xml:space="preserve">(1), 9-60.</w:t>
       </w:r>
     </w:p>
     <w:p>
@@ -3501,11 +3991,35 @@
         <w:rPr>
           <w:rFonts w:ascii="Times New Roman" w:cs="David" w:eastAsia="David" w:hAnsi="Times New Roman"/>
           <w:b w:val="false"/>
-          <w:color w:val="000000"/>
-          <w:sz w:val="24"/>
-          <w:szCs w:val="24"/>
-        </w:rPr>
-        <w:t xml:space="preserve">Grinshtain, Y., &amp; Harpaz, G. (2023). Factors that shape helping relations between parents and teachers: The case of Israeli Arab and Jewish parents. School Community Journal, 33(1), 165-190.</w:t>
+          <w:i w:val="false"/>
+          <w:color w:val="000000"/>
+          <w:sz w:val="24"/>
+          <w:szCs w:val="24"/>
+        </w:rPr>
+        <w:t xml:space="preserve">Grinshtain, Y., &amp; Harpaz, G. (2023). Factors that shape helping relations between parents and teachers: The case of Israeli Arab and Jewish parents. </w:t>
+      </w:r>
+      <w:r>
+        <w:rPr>
+          <w:rFonts w:ascii="Times New Roman" w:cs="David" w:eastAsia="David" w:hAnsi="Times New Roman"/>
+          <w:b w:val="false"/>
+          <w:i/>
+          <w:iCs/>
+          <w:color w:val="000000"/>
+          <w:sz w:val="24"/>
+          <w:szCs w:val="24"/>
+        </w:rPr>
+        <w:t xml:space="preserve">School Community Journal, 33</w:t>
+      </w:r>
+      <w:r>
+        <w:rPr>
+          <w:rFonts w:ascii="Times New Roman" w:cs="David" w:eastAsia="David" w:hAnsi="Times New Roman"/>
+          <w:b w:val="false"/>
+          <w:i w:val="false"/>
+          <w:color w:val="000000"/>
+          <w:sz w:val="24"/>
+          <w:szCs w:val="24"/>
+        </w:rPr>
+        <w:t xml:space="preserve">(1), 165-190.</w:t>
       </w:r>
     </w:p>
     <w:p>
@@ -3518,11 +4032,35 @@
         <w:rPr>
           <w:rFonts w:ascii="Times New Roman" w:cs="David" w:eastAsia="David" w:hAnsi="Times New Roman"/>
           <w:b w:val="false"/>
-          <w:color w:val="000000"/>
-          <w:sz w:val="24"/>
-          <w:szCs w:val="24"/>
-        </w:rPr>
-        <w:t xml:space="preserve">Hamilton, V. E. (2024). The conflict over parents' rights. National Education Policy Center. http://nepc.colorado.edu/publication/parents-rights</w:t>
+          <w:i w:val="false"/>
+          <w:color w:val="000000"/>
+          <w:sz w:val="24"/>
+          <w:szCs w:val="24"/>
+        </w:rPr>
+        <w:t xml:space="preserve">Hamilton, V. E. (2024). </w:t>
+      </w:r>
+      <w:r>
+        <w:rPr>
+          <w:rFonts w:ascii="Times New Roman" w:cs="David" w:eastAsia="David" w:hAnsi="Times New Roman"/>
+          <w:b w:val="false"/>
+          <w:i/>
+          <w:iCs/>
+          <w:color w:val="000000"/>
+          <w:sz w:val="24"/>
+          <w:szCs w:val="24"/>
+        </w:rPr>
+        <w:t xml:space="preserve">The conflict over parents' rights</w:t>
+      </w:r>
+      <w:r>
+        <w:rPr>
+          <w:rFonts w:ascii="Times New Roman" w:cs="David" w:eastAsia="David" w:hAnsi="Times New Roman"/>
+          <w:b w:val="false"/>
+          <w:i w:val="false"/>
+          <w:color w:val="000000"/>
+          <w:sz w:val="24"/>
+          <w:szCs w:val="24"/>
+        </w:rPr>
+        <w:t xml:space="preserve">. National Education Policy Center. http://nepc.colorado.edu/publication/parents-rights</w:t>
       </w:r>
     </w:p>
     <w:p>
@@ -3535,11 +4073,35 @@
         <w:rPr>
           <w:rFonts w:ascii="Times New Roman" w:cs="David" w:eastAsia="David" w:hAnsi="Times New Roman"/>
           <w:b w:val="false"/>
-          <w:color w:val="000000"/>
-          <w:sz w:val="24"/>
-          <w:szCs w:val="24"/>
-        </w:rPr>
-        <w:t xml:space="preserve">Hornby, G., &amp; Lafaele, R. (2011). Barriers to parental involvement in education: An explanatory model. Educational Review, 63(1), 37-52. https://doi.org/10.1080/00131911.2010.488049</w:t>
+          <w:i w:val="false"/>
+          <w:color w:val="000000"/>
+          <w:sz w:val="24"/>
+          <w:szCs w:val="24"/>
+        </w:rPr>
+        <w:t xml:space="preserve">Hornby, G., &amp; Lafaele, R. (2011). Barriers to parental involvement in education: An explanatory model. </w:t>
+      </w:r>
+      <w:r>
+        <w:rPr>
+          <w:rFonts w:ascii="Times New Roman" w:cs="David" w:eastAsia="David" w:hAnsi="Times New Roman"/>
+          <w:b w:val="false"/>
+          <w:i/>
+          <w:iCs/>
+          <w:color w:val="000000"/>
+          <w:sz w:val="24"/>
+          <w:szCs w:val="24"/>
+        </w:rPr>
+        <w:t xml:space="preserve">Educational Review, 63</w:t>
+      </w:r>
+      <w:r>
+        <w:rPr>
+          <w:rFonts w:ascii="Times New Roman" w:cs="David" w:eastAsia="David" w:hAnsi="Times New Roman"/>
+          <w:b w:val="false"/>
+          <w:i w:val="false"/>
+          <w:color w:val="000000"/>
+          <w:sz w:val="24"/>
+          <w:szCs w:val="24"/>
+        </w:rPr>
+        <w:t xml:space="preserve">(1), 37-52. https://doi.org/10.1080/00131911.2010.488049</w:t>
       </w:r>
     </w:p>
     <w:p>
@@ -3552,11 +4114,35 @@
         <w:rPr>
           <w:rFonts w:ascii="Times New Roman" w:cs="David" w:eastAsia="David" w:hAnsi="Times New Roman"/>
           <w:b w:val="false"/>
-          <w:color w:val="000000"/>
-          <w:sz w:val="24"/>
-          <w:szCs w:val="24"/>
-        </w:rPr>
-        <w:t xml:space="preserve">Hyassat, M., Al-Bakar, A., Al-Makahleh, A., &amp; Al-Zyoud, N. (2024). Special education teachers' perceptions of parental involvement in inclusive education. Education Sciences, 14, Article 294. https://doi.org/10.3390/educsci14030294</w:t>
+          <w:i w:val="false"/>
+          <w:color w:val="000000"/>
+          <w:sz w:val="24"/>
+          <w:szCs w:val="24"/>
+        </w:rPr>
+        <w:t xml:space="preserve">Hyassat, M., Al-Bakar, A., Al-Makahleh, A., &amp; Al-Zyoud, N. (2024). Special education teachers' perceptions of parental involvement in inclusive education. </w:t>
+      </w:r>
+      <w:r>
+        <w:rPr>
+          <w:rFonts w:ascii="Times New Roman" w:cs="David" w:eastAsia="David" w:hAnsi="Times New Roman"/>
+          <w:b w:val="false"/>
+          <w:i/>
+          <w:iCs/>
+          <w:color w:val="000000"/>
+          <w:sz w:val="24"/>
+          <w:szCs w:val="24"/>
+        </w:rPr>
+        <w:t xml:space="preserve">Education Sciences, 14</w:t>
+      </w:r>
+      <w:r>
+        <w:rPr>
+          <w:rFonts w:ascii="Times New Roman" w:cs="David" w:eastAsia="David" w:hAnsi="Times New Roman"/>
+          <w:b w:val="false"/>
+          <w:i w:val="false"/>
+          <w:color w:val="000000"/>
+          <w:sz w:val="24"/>
+          <w:szCs w:val="24"/>
+        </w:rPr>
+        <w:t xml:space="preserve">, Article 294. https://doi.org/10.3390/educsci14030294</w:t>
       </w:r>
     </w:p>
     <w:p>
@@ -3569,11 +4155,35 @@
         <w:rPr>
           <w:rFonts w:ascii="Times New Roman" w:cs="David" w:eastAsia="David" w:hAnsi="Times New Roman"/>
           <w:b w:val="false"/>
-          <w:color w:val="000000"/>
-          <w:sz w:val="24"/>
-          <w:szCs w:val="24"/>
-        </w:rPr>
-        <w:t xml:space="preserve">Jeynes, W. H. (2024). A meta-analysis: The relationship between the parental expectations component of parental involvement with students' academic achievement. Urban Education, 59(1), 63-95. https://doi.org/10.1177/00420859211073892</w:t>
+          <w:i w:val="false"/>
+          <w:color w:val="000000"/>
+          <w:sz w:val="24"/>
+          <w:szCs w:val="24"/>
+        </w:rPr>
+        <w:t xml:space="preserve">Jeynes, W. H. (2024). A meta-analysis: The relationship between the parental expectations component of parental involvement with students' academic achievement. </w:t>
+      </w:r>
+      <w:r>
+        <w:rPr>
+          <w:rFonts w:ascii="Times New Roman" w:cs="David" w:eastAsia="David" w:hAnsi="Times New Roman"/>
+          <w:b w:val="false"/>
+          <w:i/>
+          <w:iCs/>
+          <w:color w:val="000000"/>
+          <w:sz w:val="24"/>
+          <w:szCs w:val="24"/>
+        </w:rPr>
+        <w:t xml:space="preserve">Urban Education, 59</w:t>
+      </w:r>
+      <w:r>
+        <w:rPr>
+          <w:rFonts w:ascii="Times New Roman" w:cs="David" w:eastAsia="David" w:hAnsi="Times New Roman"/>
+          <w:b w:val="false"/>
+          <w:i w:val="false"/>
+          <w:color w:val="000000"/>
+          <w:sz w:val="24"/>
+          <w:szCs w:val="24"/>
+        </w:rPr>
+        <w:t xml:space="preserve">(1), 63-95. https://doi.org/10.1177/00420859211073892</w:t>
       </w:r>
     </w:p>
     <w:p>
@@ -3586,11 +4196,35 @@
         <w:rPr>
           <w:rFonts w:ascii="Times New Roman" w:cs="David" w:eastAsia="David" w:hAnsi="Times New Roman"/>
           <w:b w:val="false"/>
-          <w:color w:val="000000"/>
-          <w:sz w:val="24"/>
-          <w:szCs w:val="24"/>
-        </w:rPr>
-        <w:t xml:space="preserve">Lipka, O., &amp; Sarid, M. (2025). Beyond the classroom: Unravelling teachers' challenges, support, and commitment in Israel's education system. Israel Affairs, 1-37. https://doi.org/10.1080/13537121.2025.2511663</w:t>
+          <w:i w:val="false"/>
+          <w:color w:val="000000"/>
+          <w:sz w:val="24"/>
+          <w:szCs w:val="24"/>
+        </w:rPr>
+        <w:t xml:space="preserve">Lipka, O., &amp; Sarid, M. (2025). Beyond the classroom: Unravelling teachers' challenges, support, and commitment in Israel's education system. </w:t>
+      </w:r>
+      <w:r>
+        <w:rPr>
+          <w:rFonts w:ascii="Times New Roman" w:cs="David" w:eastAsia="David" w:hAnsi="Times New Roman"/>
+          <w:b w:val="false"/>
+          <w:i/>
+          <w:iCs/>
+          <w:color w:val="000000"/>
+          <w:sz w:val="24"/>
+          <w:szCs w:val="24"/>
+        </w:rPr>
+        <w:t xml:space="preserve">Israel Affairs</w:t>
+      </w:r>
+      <w:r>
+        <w:rPr>
+          <w:rFonts w:ascii="Times New Roman" w:cs="David" w:eastAsia="David" w:hAnsi="Times New Roman"/>
+          <w:b w:val="false"/>
+          <w:i w:val="false"/>
+          <w:color w:val="000000"/>
+          <w:sz w:val="24"/>
+          <w:szCs w:val="24"/>
+        </w:rPr>
+        <w:t xml:space="preserve">, 1-37. https://doi.org/10.1080/13537121.2025.2511663</w:t>
       </w:r>
     </w:p>
     <w:p>
@@ -3603,11 +4237,35 @@
         <w:rPr>
           <w:rFonts w:ascii="Times New Roman" w:cs="David" w:eastAsia="David" w:hAnsi="Times New Roman"/>
           <w:b w:val="false"/>
-          <w:color w:val="000000"/>
-          <w:sz w:val="24"/>
-          <w:szCs w:val="24"/>
-        </w:rPr>
-        <w:t xml:space="preserve">Malala, B. (2018). An analysis of the causes of parent teacher conflicts at Blem Secondary School in Livingstone [Master's thesis, University of Zambia and Zimbabwe Open University].</w:t>
+          <w:i w:val="false"/>
+          <w:color w:val="000000"/>
+          <w:sz w:val="24"/>
+          <w:szCs w:val="24"/>
+        </w:rPr>
+        <w:t xml:space="preserve">Malala, B. (2018). </w:t>
+      </w:r>
+      <w:r>
+        <w:rPr>
+          <w:rFonts w:ascii="Times New Roman" w:cs="David" w:eastAsia="David" w:hAnsi="Times New Roman"/>
+          <w:b w:val="false"/>
+          <w:i/>
+          <w:iCs/>
+          <w:color w:val="000000"/>
+          <w:sz w:val="24"/>
+          <w:szCs w:val="24"/>
+        </w:rPr>
+        <w:t xml:space="preserve">An analysis of the causes of parent teacher conflicts at Blem Secondary School in Livingstone</w:t>
+      </w:r>
+      <w:r>
+        <w:rPr>
+          <w:rFonts w:ascii="Times New Roman" w:cs="David" w:eastAsia="David" w:hAnsi="Times New Roman"/>
+          <w:b w:val="false"/>
+          <w:i w:val="false"/>
+          <w:color w:val="000000"/>
+          <w:sz w:val="24"/>
+          <w:szCs w:val="24"/>
+        </w:rPr>
+        <w:t xml:space="preserve"> [Master's thesis, University of Zambia and Zimbabwe Open University].</w:t>
       </w:r>
     </w:p>
     <w:p>
@@ -3620,11 +4278,35 @@
         <w:rPr>
           <w:rFonts w:ascii="Times New Roman" w:cs="David" w:eastAsia="David" w:hAnsi="Times New Roman"/>
           <w:b w:val="false"/>
-          <w:color w:val="000000"/>
-          <w:sz w:val="24"/>
-          <w:szCs w:val="24"/>
-        </w:rPr>
-        <w:t xml:space="preserve">Mann, G., &amp; Gilmore, L. (2023). Barriers to positive parent-teacher partnerships: The views of parents and teachers in an inclusive education context. International Journal of Inclusive Education, 27(14), 1503-1515. https://doi.org/10.1080/13603116.2021.1900426</w:t>
+          <w:i w:val="false"/>
+          <w:color w:val="000000"/>
+          <w:sz w:val="24"/>
+          <w:szCs w:val="24"/>
+        </w:rPr>
+        <w:t xml:space="preserve">Mann, G., &amp; Gilmore, L. (2023). Barriers to positive parent-teacher partnerships: The views of parents and teachers in an inclusive education context. </w:t>
+      </w:r>
+      <w:r>
+        <w:rPr>
+          <w:rFonts w:ascii="Times New Roman" w:cs="David" w:eastAsia="David" w:hAnsi="Times New Roman"/>
+          <w:b w:val="false"/>
+          <w:i/>
+          <w:iCs/>
+          <w:color w:val="000000"/>
+          <w:sz w:val="24"/>
+          <w:szCs w:val="24"/>
+        </w:rPr>
+        <w:t xml:space="preserve">International Journal of Inclusive Education, 27</w:t>
+      </w:r>
+      <w:r>
+        <w:rPr>
+          <w:rFonts w:ascii="Times New Roman" w:cs="David" w:eastAsia="David" w:hAnsi="Times New Roman"/>
+          <w:b w:val="false"/>
+          <w:i w:val="false"/>
+          <w:color w:val="000000"/>
+          <w:sz w:val="24"/>
+          <w:szCs w:val="24"/>
+        </w:rPr>
+        <w:t xml:space="preserve">(14), 1503-1515. https://doi.org/10.1080/13603116.2021.1900426</w:t>
       </w:r>
     </w:p>
     <w:p>
@@ -3637,11 +4319,35 @@
         <w:rPr>
           <w:rFonts w:ascii="Times New Roman" w:cs="David" w:eastAsia="David" w:hAnsi="Times New Roman"/>
           <w:b w:val="false"/>
-          <w:color w:val="000000"/>
-          <w:sz w:val="24"/>
-          <w:szCs w:val="24"/>
-        </w:rPr>
-        <w:t xml:space="preserve">Milosavljević Đukić, T. B., Bogavac, D. S., Stojadinović, A. M., &amp; Rajčević, P. D. (2022). Parental involvement in education and collaboration with school. International Journal of Cognitive Research in Science, Engineering and Education, 10(1), 1-14. https://doi.org/10.23947/2334-8496-2022-10-1-01-14</w:t>
+          <w:i w:val="false"/>
+          <w:color w:val="000000"/>
+          <w:sz w:val="24"/>
+          <w:szCs w:val="24"/>
+        </w:rPr>
+        <w:t xml:space="preserve">Milosavljević Đukić, T. B., Bogavac, D. S., Stojadinović, A. M., &amp; Rajčević, P. D. (2022). Parental involvement in education and collaboration with school. </w:t>
+      </w:r>
+      <w:r>
+        <w:rPr>
+          <w:rFonts w:ascii="Times New Roman" w:cs="David" w:eastAsia="David" w:hAnsi="Times New Roman"/>
+          <w:b w:val="false"/>
+          <w:i/>
+          <w:iCs/>
+          <w:color w:val="000000"/>
+          <w:sz w:val="24"/>
+          <w:szCs w:val="24"/>
+        </w:rPr>
+        <w:t xml:space="preserve">International Journal of Cognitive Research in Science, Engineering and Education, 10</w:t>
+      </w:r>
+      <w:r>
+        <w:rPr>
+          <w:rFonts w:ascii="Times New Roman" w:cs="David" w:eastAsia="David" w:hAnsi="Times New Roman"/>
+          <w:b w:val="false"/>
+          <w:i w:val="false"/>
+          <w:color w:val="000000"/>
+          <w:sz w:val="24"/>
+          <w:szCs w:val="24"/>
+        </w:rPr>
+        <w:t xml:space="preserve">(1), 1-14. https://doi.org/10.23947/2334-8496-2022-10-1-01-14</w:t>
       </w:r>
     </w:p>
     <w:p>
@@ -3654,11 +4360,35 @@
         <w:rPr>
           <w:rFonts w:ascii="Times New Roman" w:cs="David" w:eastAsia="David" w:hAnsi="Times New Roman"/>
           <w:b w:val="false"/>
-          <w:color w:val="000000"/>
-          <w:sz w:val="24"/>
-          <w:szCs w:val="24"/>
-        </w:rPr>
-        <w:t xml:space="preserve">Paseka, A., &amp; Rabušicová, M. (2023). Parental involvement: Changes and challenges [Editorial]. Studia Paedagogica, 28(2), 6-10.</w:t>
+          <w:i w:val="false"/>
+          <w:color w:val="000000"/>
+          <w:sz w:val="24"/>
+          <w:szCs w:val="24"/>
+        </w:rPr>
+        <w:t xml:space="preserve">Paseka, A., &amp; Rabušicová, M. (2023). Parental involvement: Changes and challenges [Editorial]. </w:t>
+      </w:r>
+      <w:r>
+        <w:rPr>
+          <w:rFonts w:ascii="Times New Roman" w:cs="David" w:eastAsia="David" w:hAnsi="Times New Roman"/>
+          <w:b w:val="false"/>
+          <w:i/>
+          <w:iCs/>
+          <w:color w:val="000000"/>
+          <w:sz w:val="24"/>
+          <w:szCs w:val="24"/>
+        </w:rPr>
+        <w:t xml:space="preserve">Studia Paedagogica, 28</w:t>
+      </w:r>
+      <w:r>
+        <w:rPr>
+          <w:rFonts w:ascii="Times New Roman" w:cs="David" w:eastAsia="David" w:hAnsi="Times New Roman"/>
+          <w:b w:val="false"/>
+          <w:i w:val="false"/>
+          <w:color w:val="000000"/>
+          <w:sz w:val="24"/>
+          <w:szCs w:val="24"/>
+        </w:rPr>
+        <w:t xml:space="preserve">(2), 6-10.</w:t>
       </w:r>
     </w:p>
     <w:p>
@@ -3671,11 +4401,35 @@
         <w:rPr>
           <w:rFonts w:ascii="Times New Roman" w:cs="David" w:eastAsia="David" w:hAnsi="Times New Roman"/>
           <w:b w:val="false"/>
-          <w:color w:val="000000"/>
-          <w:sz w:val="24"/>
-          <w:szCs w:val="24"/>
-        </w:rPr>
-        <w:t xml:space="preserve">Peleg, A., &amp; Levy, I. (2023). Safe educational partnership with parents: A new integrative model of parent-teacher relationships in a diverse, polarized and changing society. Sociology International Journal, 7(1), 22-30. https://doi.org/10.15406/sij.2023.07.00320</w:t>
+          <w:i w:val="false"/>
+          <w:color w:val="000000"/>
+          <w:sz w:val="24"/>
+          <w:szCs w:val="24"/>
+        </w:rPr>
+        <w:t xml:space="preserve">Peleg, A., &amp; Levy, I. (2023). Safe educational partnership with parents: A new integrative model of parent-teacher relationships in a diverse, polarized and changing society. </w:t>
+      </w:r>
+      <w:r>
+        <w:rPr>
+          <w:rFonts w:ascii="Times New Roman" w:cs="David" w:eastAsia="David" w:hAnsi="Times New Roman"/>
+          <w:b w:val="false"/>
+          <w:i/>
+          <w:iCs/>
+          <w:color w:val="000000"/>
+          <w:sz w:val="24"/>
+          <w:szCs w:val="24"/>
+        </w:rPr>
+        <w:t xml:space="preserve">Sociology International Journal, 7</w:t>
+      </w:r>
+      <w:r>
+        <w:rPr>
+          <w:rFonts w:ascii="Times New Roman" w:cs="David" w:eastAsia="David" w:hAnsi="Times New Roman"/>
+          <w:b w:val="false"/>
+          <w:i w:val="false"/>
+          <w:color w:val="000000"/>
+          <w:sz w:val="24"/>
+          <w:szCs w:val="24"/>
+        </w:rPr>
+        <w:t xml:space="preserve">(1), 22-30. https://doi.org/10.15406/sij.2023.07.00320</w:t>
       </w:r>
     </w:p>
     <w:p>
@@ -3688,11 +4442,35 @@
         <w:rPr>
           <w:rFonts w:ascii="Times New Roman" w:cs="David" w:eastAsia="David" w:hAnsi="Times New Roman"/>
           <w:b w:val="false"/>
-          <w:color w:val="000000"/>
-          <w:sz w:val="24"/>
-          <w:szCs w:val="24"/>
-        </w:rPr>
-        <w:t xml:space="preserve">Pramanik, R., Heng, P. H., &amp; Tiatri, S. (2023). Parental involvement: Teachers' perceptions and their role in teacher well-being. International Journal of Application on Social Science and Humanities, 1(1), 306-316. https://doi.org/10.24912/ijassh.v1i1.25967</w:t>
+          <w:i w:val="false"/>
+          <w:color w:val="000000"/>
+          <w:sz w:val="24"/>
+          <w:szCs w:val="24"/>
+        </w:rPr>
+        <w:t xml:space="preserve">Pramanik, R., Heng, P. H., &amp; Tiatri, S. (2023). Parental involvement: Teachers' perceptions and their role in teacher well-being. </w:t>
+      </w:r>
+      <w:r>
+        <w:rPr>
+          <w:rFonts w:ascii="Times New Roman" w:cs="David" w:eastAsia="David" w:hAnsi="Times New Roman"/>
+          <w:b w:val="false"/>
+          <w:i/>
+          <w:iCs/>
+          <w:color w:val="000000"/>
+          <w:sz w:val="24"/>
+          <w:szCs w:val="24"/>
+        </w:rPr>
+        <w:t xml:space="preserve">International Journal of Application on Social Science and Humanities, 1</w:t>
+      </w:r>
+      <w:r>
+        <w:rPr>
+          <w:rFonts w:ascii="Times New Roman" w:cs="David" w:eastAsia="David" w:hAnsi="Times New Roman"/>
+          <w:b w:val="false"/>
+          <w:i w:val="false"/>
+          <w:color w:val="000000"/>
+          <w:sz w:val="24"/>
+          <w:szCs w:val="24"/>
+        </w:rPr>
+        <w:t xml:space="preserve">(1), 306-316. https://doi.org/10.24912/ijassh.v1i1.25967</w:t>
       </w:r>
     </w:p>
     <w:p>
@@ -3705,11 +4483,35 @@
         <w:rPr>
           <w:rFonts w:ascii="Times New Roman" w:cs="David" w:eastAsia="David" w:hAnsi="Times New Roman"/>
           <w:b w:val="false"/>
-          <w:color w:val="000000"/>
-          <w:sz w:val="24"/>
-          <w:szCs w:val="24"/>
-        </w:rPr>
-        <w:t xml:space="preserve">Şengönül, T. (2022). A review of the relationship between parental involvement and children's academic achievement and the role of family socioeconomic status in this relationship. Pegem Journal of Education and Instruction, 12(2), 32-57. https://doi.org/10.47750/pegegog.12.02.04</w:t>
+          <w:i w:val="false"/>
+          <w:color w:val="000000"/>
+          <w:sz w:val="24"/>
+          <w:szCs w:val="24"/>
+        </w:rPr>
+        <w:t xml:space="preserve">Şengönül, T. (2022). A review of the relationship between parental involvement and children's academic achievement and the role of family socioeconomic status in this relationship. </w:t>
+      </w:r>
+      <w:r>
+        <w:rPr>
+          <w:rFonts w:ascii="Times New Roman" w:cs="David" w:eastAsia="David" w:hAnsi="Times New Roman"/>
+          <w:b w:val="false"/>
+          <w:i/>
+          <w:iCs/>
+          <w:color w:val="000000"/>
+          <w:sz w:val="24"/>
+          <w:szCs w:val="24"/>
+        </w:rPr>
+        <w:t xml:space="preserve">Pegem Journal of Education and Instruction, 12</w:t>
+      </w:r>
+      <w:r>
+        <w:rPr>
+          <w:rFonts w:ascii="Times New Roman" w:cs="David" w:eastAsia="David" w:hAnsi="Times New Roman"/>
+          <w:b w:val="false"/>
+          <w:i w:val="false"/>
+          <w:color w:val="000000"/>
+          <w:sz w:val="24"/>
+          <w:szCs w:val="24"/>
+        </w:rPr>
+        <w:t xml:space="preserve">(2), 32-57. https://doi.org/10.47750/pegegog.12.02.04</w:t>
       </w:r>
     </w:p>
     <w:p>
@@ -3722,11 +4524,35 @@
         <w:rPr>
           <w:rFonts w:ascii="Times New Roman" w:cs="David" w:eastAsia="David" w:hAnsi="Times New Roman"/>
           <w:b w:val="false"/>
-          <w:color w:val="000000"/>
-          <w:sz w:val="24"/>
-          <w:szCs w:val="24"/>
-        </w:rPr>
-        <w:t xml:space="preserve">Smith, T. E., Holmes, S. R., Romero, M. E., &amp; Sheridan, S. M. (2022). Evaluating the effects of family-school engagement interventions on parent-teacher relationships: A meta-analysis. School Mental Health, 14, 918-936. https://doi.org/10.1007/s12310-022-09510-9</w:t>
+          <w:i w:val="false"/>
+          <w:color w:val="000000"/>
+          <w:sz w:val="24"/>
+          <w:szCs w:val="24"/>
+        </w:rPr>
+        <w:t xml:space="preserve">Smith, T. E., Holmes, S. R., Romero, M. E., &amp; Sheridan, S. M. (2022). Evaluating the effects of family-school engagement interventions on parent-teacher relationships: A meta-analysis. </w:t>
+      </w:r>
+      <w:r>
+        <w:rPr>
+          <w:rFonts w:ascii="Times New Roman" w:cs="David" w:eastAsia="David" w:hAnsi="Times New Roman"/>
+          <w:b w:val="false"/>
+          <w:i/>
+          <w:iCs/>
+          <w:color w:val="000000"/>
+          <w:sz w:val="24"/>
+          <w:szCs w:val="24"/>
+        </w:rPr>
+        <w:t xml:space="preserve">School Mental Health, 14</w:t>
+      </w:r>
+      <w:r>
+        <w:rPr>
+          <w:rFonts w:ascii="Times New Roman" w:cs="David" w:eastAsia="David" w:hAnsi="Times New Roman"/>
+          <w:b w:val="false"/>
+          <w:i w:val="false"/>
+          <w:color w:val="000000"/>
+          <w:sz w:val="24"/>
+          <w:szCs w:val="24"/>
+        </w:rPr>
+        <w:t xml:space="preserve">, 918-936. https://doi.org/10.1007/s12310-022-09510-9</w:t>
       </w:r>
     </w:p>
     <w:p>
@@ -3739,11 +4565,35 @@
         <w:rPr>
           <w:rFonts w:ascii="Times New Roman" w:cs="David" w:eastAsia="David" w:hAnsi="Times New Roman"/>
           <w:b w:val="false"/>
-          <w:color w:val="000000"/>
-          <w:sz w:val="24"/>
-          <w:szCs w:val="24"/>
-        </w:rPr>
-        <w:t xml:space="preserve">Syuraini, Hidayat, H., Arini, F. D., &amp; Jamaris. (2022). Exploring factors of the parent-teacher partnership affecting learning outcomes: Empirical study in the early childhood education context. International Journal of Instruction, 15(4), 411-434. https://doi.org/10.29333/iji.2022.15423a</w:t>
+          <w:i w:val="false"/>
+          <w:color w:val="000000"/>
+          <w:sz w:val="24"/>
+          <w:szCs w:val="24"/>
+        </w:rPr>
+        <w:t xml:space="preserve">Syuraini, Hidayat, H., Arini, F. D., &amp; Jamaris. (2022). Exploring factors of the parent-teacher partnership affecting learning outcomes: Empirical study in the early childhood education context. </w:t>
+      </w:r>
+      <w:r>
+        <w:rPr>
+          <w:rFonts w:ascii="Times New Roman" w:cs="David" w:eastAsia="David" w:hAnsi="Times New Roman"/>
+          <w:b w:val="false"/>
+          <w:i/>
+          <w:iCs/>
+          <w:color w:val="000000"/>
+          <w:sz w:val="24"/>
+          <w:szCs w:val="24"/>
+        </w:rPr>
+        <w:t xml:space="preserve">International Journal of Instruction, 15</w:t>
+      </w:r>
+      <w:r>
+        <w:rPr>
+          <w:rFonts w:ascii="Times New Roman" w:cs="David" w:eastAsia="David" w:hAnsi="Times New Roman"/>
+          <w:b w:val="false"/>
+          <w:i w:val="false"/>
+          <w:color w:val="000000"/>
+          <w:sz w:val="24"/>
+          <w:szCs w:val="24"/>
+        </w:rPr>
+        <w:t xml:space="preserve">(4), 411-434. https://doi.org/10.29333/iji.2022.15423a</w:t>
       </w:r>
     </w:p>
     <w:p>
@@ -3756,11 +4606,35 @@
         <w:rPr>
           <w:rFonts w:ascii="Times New Roman" w:cs="David" w:eastAsia="David" w:hAnsi="Times New Roman"/>
           <w:b w:val="false"/>
-          <w:color w:val="000000"/>
-          <w:sz w:val="24"/>
-          <w:szCs w:val="24"/>
-        </w:rPr>
-        <w:t xml:space="preserve">Wilder, S. (2014). Effects of parental involvement on academic achievement: A meta-synthesis. Educational Review, 66(3), 377-397. https://doi.org/10.1080/00131911.2013.780009</w:t>
+          <w:i w:val="false"/>
+          <w:color w:val="000000"/>
+          <w:sz w:val="24"/>
+          <w:szCs w:val="24"/>
+        </w:rPr>
+        <w:t xml:space="preserve">Wilder, S. (2014). Effects of parental involvement on academic achievement: A meta-synthesis. </w:t>
+      </w:r>
+      <w:r>
+        <w:rPr>
+          <w:rFonts w:ascii="Times New Roman" w:cs="David" w:eastAsia="David" w:hAnsi="Times New Roman"/>
+          <w:b w:val="false"/>
+          <w:i/>
+          <w:iCs/>
+          <w:color w:val="000000"/>
+          <w:sz w:val="24"/>
+          <w:szCs w:val="24"/>
+        </w:rPr>
+        <w:t xml:space="preserve">Educational Review, 66</w:t>
+      </w:r>
+      <w:r>
+        <w:rPr>
+          <w:rFonts w:ascii="Times New Roman" w:cs="David" w:eastAsia="David" w:hAnsi="Times New Roman"/>
+          <w:b w:val="false"/>
+          <w:i w:val="false"/>
+          <w:color w:val="000000"/>
+          <w:sz w:val="24"/>
+          <w:szCs w:val="24"/>
+        </w:rPr>
+        <w:t xml:space="preserve">(3), 377-397. https://doi.org/10.1080/00131911.2013.780009</w:t>
       </w:r>
     </w:p>
     <w:p>
@@ -3773,11 +4647,35 @@
         <w:rPr>
           <w:rFonts w:ascii="Times New Roman" w:cs="David" w:eastAsia="David" w:hAnsi="Times New Roman"/>
           <w:b w:val="false"/>
-          <w:color w:val="000000"/>
-          <w:sz w:val="24"/>
-          <w:szCs w:val="24"/>
-        </w:rPr>
-        <w:t xml:space="preserve">Wildmon, M. E., Anthony, K. V., &amp; Kamau, Z. J. (2024). Identifying and navigating the barriers of parental involvement in early childhood education. Current Issues in Education, 25(1). https://doi.org/10.14507/cie.vol25iss1.2146</w:t>
+          <w:i w:val="false"/>
+          <w:color w:val="000000"/>
+          <w:sz w:val="24"/>
+          <w:szCs w:val="24"/>
+        </w:rPr>
+        <w:t xml:space="preserve">Wildmon, M. E., Anthony, K. V., &amp; Kamau, Z. J. (2024). Identifying and navigating the barriers of parental involvement in early childhood education. </w:t>
+      </w:r>
+      <w:r>
+        <w:rPr>
+          <w:rFonts w:ascii="Times New Roman" w:cs="David" w:eastAsia="David" w:hAnsi="Times New Roman"/>
+          <w:b w:val="false"/>
+          <w:i/>
+          <w:iCs/>
+          <w:color w:val="000000"/>
+          <w:sz w:val="24"/>
+          <w:szCs w:val="24"/>
+        </w:rPr>
+        <w:t xml:space="preserve">Current Issues in Education, 25</w:t>
+      </w:r>
+      <w:r>
+        <w:rPr>
+          <w:rFonts w:ascii="Times New Roman" w:cs="David" w:eastAsia="David" w:hAnsi="Times New Roman"/>
+          <w:b w:val="false"/>
+          <w:i w:val="false"/>
+          <w:color w:val="000000"/>
+          <w:sz w:val="24"/>
+          <w:szCs w:val="24"/>
+        </w:rPr>
+        <w:t xml:space="preserve">(1). https://doi.org/10.14507/cie.vol25iss1.2146</w:t>
       </w:r>
     </w:p>
     <w:p>
@@ -3790,11 +4688,35 @@
         <w:rPr>
           <w:rFonts w:ascii="Times New Roman" w:cs="David" w:eastAsia="David" w:hAnsi="Times New Roman"/>
           <w:b w:val="false"/>
-          <w:color w:val="000000"/>
-          <w:sz w:val="24"/>
-          <w:szCs w:val="24"/>
-        </w:rPr>
-        <w:t xml:space="preserve">Woltran, F. (2025). Insights into teachers' perceptions of parental involvement as a predictor of educational inequity. Education 3-13, 53(8), 1285-1298. https://doi.org/10.1080/03004279.2023.2265392</w:t>
+          <w:i w:val="false"/>
+          <w:color w:val="000000"/>
+          <w:sz w:val="24"/>
+          <w:szCs w:val="24"/>
+        </w:rPr>
+        <w:t xml:space="preserve">Woltran, F. (2025). Insights into teachers' perceptions of parental involvement as a predictor of educational inequity. </w:t>
+      </w:r>
+      <w:r>
+        <w:rPr>
+          <w:rFonts w:ascii="Times New Roman" w:cs="David" w:eastAsia="David" w:hAnsi="Times New Roman"/>
+          <w:b w:val="false"/>
+          <w:i/>
+          <w:iCs/>
+          <w:color w:val="000000"/>
+          <w:sz w:val="24"/>
+          <w:szCs w:val="24"/>
+        </w:rPr>
+        <w:t xml:space="preserve">Education 3-13, 53</w:t>
+      </w:r>
+      <w:r>
+        <w:rPr>
+          <w:rFonts w:ascii="Times New Roman" w:cs="David" w:eastAsia="David" w:hAnsi="Times New Roman"/>
+          <w:b w:val="false"/>
+          <w:i w:val="false"/>
+          <w:color w:val="000000"/>
+          <w:sz w:val="24"/>
+          <w:szCs w:val="24"/>
+        </w:rPr>
+        <w:t xml:space="preserve">(8), 1285-1298. https://doi.org/10.1080/03004279.2023.2265392</w:t>
       </w:r>
     </w:p>
     <w:sectPr>

</xml_diff>

<commit_message>
Add two recent Hebrew sources to seminar paper
Add Cohen Zecharia & Tubin (2024, Iyunim BaChinuch) and the 2026
Ministry of Education director-general circular on parent-staff
communication, integrated into chapter 3 and the practical
recommendations. 29 sources total, 7 in Hebrew; 7,868 content words.

Co-Authored-By: Claude Fable 5 <noreply@anthropic.com>
Claude-Session: https://claude.ai/code/session_01FN9ao3FedeqCyCJjoBfH25
</commit_message>
<xml_diff>
--- a/docs/התמודדות מורים עם מעורבות הורים - מתוקן.docx
+++ b/docs/התמודדות מורים עם מעורבות הורים - מתוקן.docx
@@ -1023,7 +1023,7 @@
                 <w:szCs w:val="24"/>
                 <w:rtl/>
               </w:rPr>
-              <w:t xml:space="preserve">23</w:t>
+              <w:t xml:space="preserve">24</w:t>
             </w:r>
           </w:p>
         </w:tc>
@@ -2777,7 +2777,7 @@
           <w:szCs w:val="24"/>
           <w:rtl/>
         </w:rPr>
-        <w:t xml:space="preserve">גם עמיתים משמשים מקור תמיכה מרכזי. מורים משתפים זה את זה בפניות שקיבלו, מתייעצים לגבי ניסוח תגובה, משווים בין פרשנויות ומחליטים יחד מתי לערב בעל תפקיד נוסף. השיח בצוות מפחית את תחושת הבדידות ומאפשר לזהות אם מדובר באירוע חד-פעמי או בדפוס רחב יותר של קשר בין המשפחה לבית הספר. כך התמיכה החברתית מתחברת לתמיכה הארגונית ומחזקת את תחושת המסוגלות המקצועית (Fisher &amp; Refael Fanyo, 2022; Lipka &amp; Sarid, 2025).</w:t>
+        <w:t xml:space="preserve">גם עמיתים משמשים מקור תמיכה מרכזי. מורים משתפים זה את זה בפניות שקיבלו, מתייעצים לגבי ניסוח תגובה, משווים בין פרשנויות ומחליטים יחד מתי לערב בעל תפקיד נוסף. השיח בצוות מפחית את תחושת הבדידות ומאפשר לזהות אם מדובר באירוע חד-פעמי או בדפוס רחב יותר של קשר בין המשפחה לבית הספר. מחקר ישראלי שליווה צוות מחנכות לפני מגפת הקורונה, במהלכה ואחריה מצא כי דילמות רבות שהעסיקו את הצוות נגעו למתח בין ציפיות ההורים לצורכי התלמידים, וכי המסגרת הצוותית סייעה לעבד אותן (כהן זכריה וטובין, 2024). כך התמיכה החברתית מתחברת לתמיכה הארגונית ומחזקת את תחושת המסוגלות המקצועית (Fisher &amp; Refael Fanyo, 2022; Lipka &amp; Sarid, 2025).</w:t>
       </w:r>
     </w:p>
     <w:p>
@@ -2835,6 +2835,25 @@
           <w:rtl/>
         </w:rPr>
         <w:t xml:space="preserve">זירה נפרדת של התמודדות היא התקשורת הדיגיטלית. הודעות מיידיות וקבוצות כיתתיות מקצרות את הדרך בין הבית לבית הספר, אך גם מוחקות את הגבול בין שעות העבודה לזמן הפרטי של המורה. גרהם-קליי (Graham-Clay, 2024) מקדישה לכך מקום מרכזי, ומציעה להגדיר מראש אילו נושאים מתאימים להודעה כתובה, אילו מחייבים שיחה, ומהו זמן התגובה המצופה. גיטונגה (Gitonga, 2023) מזכיר כי תקשורת דיגיטלית היא ערוץ מעורבות לכל דבר, ולכן ניהולה הנכון הוא חלק מניהול הקשר עם ההורים ולא עניין טכני בלבד.</w:t>
+      </w:r>
+    </w:p>
+    <w:p>
+      <w:pPr>
+        <w:bidi/>
+        <w:spacing w:after="120" w:line="360"/>
+        <w:jc w:val="both"/>
+      </w:pPr>
+      <w:r>
+        <w:rPr>
+          <w:rFonts w:ascii="Times New Roman" w:cs="David" w:eastAsia="David" w:hAnsi="Times New Roman"/>
+          <w:b w:val="false"/>
+          <w:i w:val="false"/>
+          <w:color w:val="000000"/>
+          <w:sz w:val="24"/>
+          <w:szCs w:val="24"/>
+          <w:rtl/>
+        </w:rPr>
+        <w:t xml:space="preserve">בישראל קיבלה הסדרה זו לאחרונה עיגון ברמת המדיניות. חוזר מנכ"ל שפרסם משרד החינוך (2026) קובע כי כל מוסד חינוכי יגדיר ויפרסם להורים את ערוצי התקשורת ואת שעות הפנייה לצוות, מסדיר כניסת הורים למוסד בתיאום מראש, ומבהיר כי החלטות מקצועיות בענייני הוראה ומשמעת נותרות בידי הגורמים המקצועיים. גרהם-קליי (Graham-Clay, 2024) מציעה עקרונות דומים ברמת המורה הבודד, וכך המדיניות המערכתית והפרקטיקה של המורה משלימות זו את זו.</w:t>
       </w:r>
     </w:p>
     <w:p>
@@ -3452,7 +3471,7 @@
           <w:szCs w:val="24"/>
           <w:rtl/>
         </w:rPr>
-        <w:t xml:space="preserve">מומלץ שבתי ספר יגבשו מדיניות ברורה לקשר עם הורים. מדיניות זו צריכה לכלול ערוצי פנייה מסודרים, זמני תגובה, חלוקת תפקידים בין מחנכים, מורים מקצועיים והנהלה, והבהרה מתי יש לעבור מהודעה כתובה לשיחה אישית. כך ניתן לצמצם אי-הבנות ולמנוע עומס בלתי מבוקר על המורים.</w:t>
+        <w:t xml:space="preserve">מומלץ שבתי ספר יגבשו מדיניות ברורה לקשר עם הורים. מדיניות זו צריכה לכלול ערוצי פנייה מסודרים, זמני תגובה, חלוקת תפקידים בין מחנכים, מורים מקצועיים והנהלה, והבהרה מתי יש לעבור מהודעה כתובה לשיחה אישית. כך ניתן לצמצם אי-הבנות ולמנוע עומס בלתי מבוקר על המורים. מדיניות כזו אף עוגנה לאחרונה בחוזר מנכ"ל (משרד החינוך, 2026), ובתי הספר נדרשים כעת לתרגם אותה לנהלים מקומיים ברורים.</w:t>
       </w:r>
     </w:p>
     <w:p>
@@ -3654,7 +3673,7 @@
           <w:szCs w:val="24"/>
           <w:rtl/>
         </w:rPr>
-        <w:t xml:space="preserve">כצנלסון, ע' (2014, אוקטובר). קשר בין הורים ומערכת החינוך של ילדיהם. </w:t>
+        <w:t xml:space="preserve">כהן זכריה, מ', וטובין, ד' (2024). משבר כהזדמנות? צוות מחנכות לפני הקורונה, בזמן המגפה ואחריה. </w:t>
       </w:r>
       <w:r>
         <w:rPr>
@@ -3667,19 +3686,19 @@
           <w:szCs w:val="24"/>
           <w:rtl/>
         </w:rPr>
-        <w:t xml:space="preserve">פסיכואקטואליה</w:t>
-      </w:r>
-      <w:r>
-        <w:rPr>
-          <w:rFonts w:ascii="Times New Roman" w:cs="David" w:eastAsia="David" w:hAnsi="Times New Roman"/>
-          <w:b w:val="false"/>
-          <w:i w:val="false"/>
-          <w:color w:val="000000"/>
-          <w:sz w:val="24"/>
-          <w:szCs w:val="24"/>
-          <w:rtl/>
-        </w:rPr>
-        <w:t xml:space="preserve">.</w:t>
+        <w:t xml:space="preserve">עיונים בחינוך, 24</w:t>
+      </w:r>
+      <w:r>
+        <w:rPr>
+          <w:rFonts w:ascii="Times New Roman" w:cs="David" w:eastAsia="David" w:hAnsi="Times New Roman"/>
+          <w:b w:val="false"/>
+          <w:i w:val="false"/>
+          <w:color w:val="000000"/>
+          <w:sz w:val="24"/>
+          <w:szCs w:val="24"/>
+          <w:rtl/>
+        </w:rPr>
+        <w:t xml:space="preserve">, 205-222.</w:t>
       </w:r>
     </w:p>
     <w:p>
@@ -3699,7 +3718,7 @@
           <w:szCs w:val="24"/>
           <w:rtl/>
         </w:rPr>
-        <w:t xml:space="preserve">משיח, א' (2023). מעורבות הורים בחינוך ילדיהם כפונקציה של גודל המשפחה: המקרה של ישראל. </w:t>
+        <w:t xml:space="preserve">כצנלסון, ע' (2014, אוקטובר). קשר בין הורים ומערכת החינוך של ילדיהם. </w:t>
       </w:r>
       <w:r>
         <w:rPr>
@@ -3712,6 +3731,51 @@
           <w:szCs w:val="24"/>
           <w:rtl/>
         </w:rPr>
+        <w:t xml:space="preserve">פסיכואקטואליה</w:t>
+      </w:r>
+      <w:r>
+        <w:rPr>
+          <w:rFonts w:ascii="Times New Roman" w:cs="David" w:eastAsia="David" w:hAnsi="Times New Roman"/>
+          <w:b w:val="false"/>
+          <w:i w:val="false"/>
+          <w:color w:val="000000"/>
+          <w:sz w:val="24"/>
+          <w:szCs w:val="24"/>
+          <w:rtl/>
+        </w:rPr>
+        <w:t xml:space="preserve">.</w:t>
+      </w:r>
+    </w:p>
+    <w:p>
+      <w:pPr>
+        <w:bidi/>
+        <w:spacing w:after="200" w:line="360"/>
+        <w:ind w:start="709" w:hanging="709"/>
+        <w:jc w:val="start"/>
+      </w:pPr>
+      <w:r>
+        <w:rPr>
+          <w:rFonts w:ascii="Times New Roman" w:cs="David" w:eastAsia="David" w:hAnsi="Times New Roman"/>
+          <w:b w:val="false"/>
+          <w:i w:val="false"/>
+          <w:color w:val="000000"/>
+          <w:sz w:val="24"/>
+          <w:szCs w:val="24"/>
+          <w:rtl/>
+        </w:rPr>
+        <w:t xml:space="preserve">משיח, א' (2023). מעורבות הורים בחינוך ילדיהם כפונקציה של גודל המשפחה: המקרה של ישראל. </w:t>
+      </w:r>
+      <w:r>
+        <w:rPr>
+          <w:rFonts w:ascii="Times New Roman" w:cs="David" w:eastAsia="David" w:hAnsi="Times New Roman"/>
+          <w:b w:val="false"/>
+          <w:i/>
+          <w:iCs/>
+          <w:color w:val="000000"/>
+          <w:sz w:val="24"/>
+          <w:szCs w:val="24"/>
+          <w:rtl/>
+        </w:rPr>
         <w:t xml:space="preserve">הלאה, 4</w:t>
       </w:r>
       <w:r>
@@ -3725,6 +3789,26 @@
           <w:rtl/>
         </w:rPr>
         <w:t xml:space="preserve">, 13-30.</w:t>
+      </w:r>
+    </w:p>
+    <w:p>
+      <w:pPr>
+        <w:bidi/>
+        <w:spacing w:after="200" w:line="360"/>
+        <w:ind w:start="709" w:hanging="709"/>
+        <w:jc w:val="start"/>
+      </w:pPr>
+      <w:r>
+        <w:rPr>
+          <w:rFonts w:ascii="Times New Roman" w:cs="David" w:eastAsia="David" w:hAnsi="Times New Roman"/>
+          <w:b w:val="false"/>
+          <w:i w:val="false"/>
+          <w:color w:val="000000"/>
+          <w:sz w:val="24"/>
+          <w:szCs w:val="24"/>
+          <w:rtl/>
+        </w:rPr>
+        <w:t xml:space="preserve">משרד החינוך (2026). [חוזר מנכ"ל בנושא הקשר והתקשורת בין הורים לצוותי החינוך]. https://apps.education.gov.il/mankal/horaa.aspx?siduri=218</w:t>
       </w:r>
     </w:p>
     <w:p>

</xml_diff>

<commit_message>
Add Open University logo to title page
Co-Authored-By: Claude Fable 5 <noreply@anthropic.com>
Claude-Session: https://claude.ai/code/session_01FN9ao3FedeqCyCJjoBfH25
</commit_message>
<xml_diff>
--- a/docs/התמודדות מורים עם מעורבות הורים - מתוקן.docx
+++ b/docs/התמודדות מורים עם מעורבות הורים - מתוקן.docx
@@ -4,41 +4,48 @@
   <w:body>
     <w:p>
       <w:pPr>
-        <w:bidi/>
-        <w:spacing w:after="800" w:line="360"/>
+        <w:spacing w:after="300" w:before="600"/>
         <w:jc w:val="center"/>
       </w:pPr>
       <w:r>
-        <w:rPr>
-          <w:rFonts w:ascii="Times New Roman" w:cs="David" w:eastAsia="David" w:hAnsi="Times New Roman"/>
-          <w:b w:val="false"/>
-          <w:i w:val="false"/>
-          <w:color w:val="000000"/>
-          <w:sz w:val="24"/>
-          <w:szCs w:val="24"/>
-          <w:rtl/>
-        </w:rPr>
-        <w:t xml:space="preserve"/>
-      </w:r>
-    </w:p>
-    <w:p>
-      <w:pPr>
-        <w:bidi/>
-        <w:spacing w:after="60" w:line="360"/>
-        <w:jc w:val="center"/>
-      </w:pPr>
-      <w:r>
-        <w:rPr>
-          <w:rFonts w:ascii="Times New Roman" w:cs="David" w:eastAsia="David" w:hAnsi="Times New Roman"/>
-          <w:b/>
-          <w:bCs/>
-          <w:i w:val="false"/>
-          <w:color w:val="000000"/>
-          <w:sz w:val="32"/>
-          <w:szCs w:val="32"/>
-          <w:rtl/>
-        </w:rPr>
-        <w:t xml:space="preserve">האוניברסיטה הפתוחה</w:t>
+        <w:drawing>
+          <wp:inline distT="0" distB="0" distL="0" distR="0">
+            <wp:extent cx="3048000" cy="638175"/>
+            <wp:effectExtent t="0" r="0" b="0" l="0"/>
+            <wp:docPr id="1" name="" descr="" title=""/>
+            <wp:cNvGraphicFramePr>
+              <a:graphicFrameLocks xmlns:a="http://schemas.openxmlformats.org/drawingml/2006/main" noChangeAspect="1"/>
+            </wp:cNvGraphicFramePr>
+            <a:graphic xmlns:a="http://schemas.openxmlformats.org/drawingml/2006/main">
+              <a:graphicData uri="http://schemas.openxmlformats.org/drawingml/2006/picture">
+                <pic:pic xmlns:pic="http://schemas.openxmlformats.org/drawingml/2006/picture">
+                  <pic:nvPicPr>
+                    <pic:cNvPr id="0" name="" descr=""/>
+                    <pic:cNvPicPr>
+                      <a:picLocks noChangeAspect="1" noChangeArrowheads="1"/>
+                    </pic:cNvPicPr>
+                  </pic:nvPicPr>
+                  <pic:blipFill>
+                    <a:blip r:embed="rId9" cstate="none"/>
+                    <a:srcRect/>
+                    <a:stretch>
+                      <a:fillRect/>
+                    </a:stretch>
+                  </pic:blipFill>
+                  <pic:spPr bwMode="auto">
+                    <a:xfrm>
+                      <a:off x="0" y="0"/>
+                      <a:ext cx="3048000" cy="638175"/>
+                    </a:xfrm>
+                    <a:prstGeom prst="rect">
+                      <a:avLst/>
+                    </a:prstGeom>
+                  </pic:spPr>
+                </pic:pic>
+              </a:graphicData>
+            </a:graphic>
+          </wp:inline>
+        </w:drawing>
       </w:r>
     </w:p>
     <w:p>

</xml_diff>

<commit_message>
Hide spelling and grammar marks in seminar paper document
Add hideSpellingErrors/hideGrammaticalErrors to document settings so
Word does not display red squiggles under English names and citations,
and fix schema element ordering in the TOC style patch.

Co-Authored-By: Claude Fable 5 <noreply@anthropic.com>
Claude-Session: https://claude.ai/code/session_01FN9ao3FedeqCyCJjoBfH25
</commit_message>
<xml_diff>
--- a/docs/התמודדות מורים עם מעורבות הורים - מתוקן.docx
+++ b/docs/התמודדות מורים עם מעורבות הורים - מתוקן.docx
@@ -4606,8 +4606,8 @@
     <w:next w:val="Normal"/>
     <w:pPr>
       <w:bidi/>
+      <w:spacing w:after="60" w:line="360"/>
       <w:jc w:val="start"/>
-      <w:spacing w:after="60" w:line="360"/>
     </w:pPr>
     <w:rPr>
       <w:rFonts w:ascii="Times New Roman" w:cs="David" w:eastAsia="David" w:hAnsi="Times New Roman"/>
@@ -4622,9 +4622,9 @@
     <w:next w:val="Normal"/>
     <w:pPr>
       <w:bidi/>
-      <w:jc w:val="start"/>
       <w:spacing w:after="60" w:line="360"/>
       <w:ind w:start="425"/>
+      <w:jc w:val="start"/>
     </w:pPr>
     <w:rPr>
       <w:rFonts w:ascii="Times New Roman" w:cs="David" w:eastAsia="David" w:hAnsi="Times New Roman"/>

</xml_diff>